<commit_message>
Add news module (Tavily + RAG + LLM)
</commit_message>
<xml_diff>
--- a/Final_project_roadmap_V0.docx
+++ b/Final_project_roadmap_V0.docx
@@ -146,113 +146,49 @@
         <w:rPr>
           <w:color w:val="3A3A3A" w:themeColor="background2" w:themeShade="40"/>
         </w:rPr>
-        <w:t>(</w:t>
-      </w:r>
-      <w:proofErr w:type="gramStart"/>
+        <w:t>(dominance</w:t>
+      </w:r>
       <w:r>
         <w:rPr>
           <w:color w:val="3A3A3A" w:themeColor="background2" w:themeShade="40"/>
         </w:rPr>
-        <w:t>dominance</w:t>
+        <w:t xml:space="preserve"> , market cap , altcoin season rate ... ) </w:t>
       </w:r>
       <w:r>
         <w:rPr>
           <w:color w:val="3A3A3A" w:themeColor="background2" w:themeShade="40"/>
         </w:rPr>
-        <w:t xml:space="preserve"> ,</w:t>
-      </w:r>
-      <w:proofErr w:type="gramEnd"/>
+        <w:t>and</w:t>
+      </w:r>
       <w:r>
         <w:rPr>
           <w:color w:val="3A3A3A" w:themeColor="background2" w:themeShade="40"/>
         </w:rPr>
-        <w:t xml:space="preserve"> market </w:t>
-      </w:r>
-      <w:proofErr w:type="gramStart"/>
+        <w:t xml:space="preserve"> deep learning </w:t>
+      </w:r>
       <w:r>
         <w:rPr>
           <w:color w:val="3A3A3A" w:themeColor="background2" w:themeShade="40"/>
         </w:rPr>
-        <w:t>cap ,</w:t>
-      </w:r>
-      <w:proofErr w:type="gramEnd"/>
+        <w:t xml:space="preserve">\ machine learning </w:t>
+      </w:r>
       <w:r>
         <w:rPr>
           <w:color w:val="3A3A3A" w:themeColor="background2" w:themeShade="40"/>
         </w:rPr>
-        <w:t xml:space="preserve"> altcoin season rate </w:t>
-      </w:r>
-      <w:proofErr w:type="gramStart"/>
+        <w:t>model</w:t>
+      </w:r>
       <w:r>
         <w:rPr>
           <w:color w:val="3A3A3A" w:themeColor="background2" w:themeShade="40"/>
         </w:rPr>
-        <w:t>... )</w:t>
-      </w:r>
-      <w:proofErr w:type="gramEnd"/>
+        <w:t xml:space="preserve"> to predict the future price trend </w:t>
+      </w:r>
       <w:r>
         <w:rPr>
           <w:color w:val="3A3A3A" w:themeColor="background2" w:themeShade="40"/>
         </w:rPr>
-        <w:t xml:space="preserve"> </w:t>
-      </w:r>
-      <w:r>
-        <w:rPr>
-          <w:color w:val="3A3A3A" w:themeColor="background2" w:themeShade="40"/>
-        </w:rPr>
-        <w:t>and</w:t>
-      </w:r>
-      <w:r>
-        <w:rPr>
-          <w:color w:val="3A3A3A" w:themeColor="background2" w:themeShade="40"/>
-        </w:rPr>
-        <w:t xml:space="preserve"> deep learning </w:t>
-      </w:r>
-      <w:r>
-        <w:rPr>
-          <w:color w:val="3A3A3A" w:themeColor="background2" w:themeShade="40"/>
-        </w:rPr>
-        <w:t xml:space="preserve">\ machine learning </w:t>
-      </w:r>
-      <w:r>
-        <w:rPr>
-          <w:color w:val="3A3A3A" w:themeColor="background2" w:themeShade="40"/>
-        </w:rPr>
-        <w:t>model</w:t>
-      </w:r>
-      <w:r>
-        <w:rPr>
-          <w:color w:val="3A3A3A" w:themeColor="background2" w:themeShade="40"/>
-        </w:rPr>
-        <w:t xml:space="preserve"> to predict the future price trend </w:t>
-      </w:r>
-      <w:proofErr w:type="gramStart"/>
-      <w:r>
-        <w:rPr>
-          <w:color w:val="3A3A3A" w:themeColor="background2" w:themeShade="40"/>
-        </w:rPr>
-        <w:t>( usually</w:t>
-      </w:r>
-      <w:proofErr w:type="gramEnd"/>
-      <w:r>
-        <w:rPr>
-          <w:color w:val="3A3A3A" w:themeColor="background2" w:themeShade="40"/>
-        </w:rPr>
-        <w:t xml:space="preserve"> not found in the </w:t>
-      </w:r>
-      <w:proofErr w:type="gramStart"/>
-      <w:r>
-        <w:rPr>
-          <w:color w:val="3A3A3A" w:themeColor="background2" w:themeShade="40"/>
-        </w:rPr>
-        <w:t>web )</w:t>
-      </w:r>
-      <w:proofErr w:type="gramEnd"/>
-      <w:r>
-        <w:rPr>
-          <w:color w:val="3A3A3A" w:themeColor="background2" w:themeShade="40"/>
-        </w:rPr>
-        <w:t xml:space="preserve"> </w:t>
+        <w:t xml:space="preserve">( usually not found in the web ) </w:t>
       </w:r>
     </w:p>
     <w:p>
@@ -270,83 +206,13 @@
         <w:rPr>
           <w:color w:val="3A3A3A" w:themeColor="background2" w:themeShade="40"/>
         </w:rPr>
-        <w:t xml:space="preserve">Retrieves the latest macro economic information from the web </w:t>
-      </w:r>
-      <w:proofErr w:type="gramStart"/>
+        <w:t xml:space="preserve">Retrieves the latest macro economic information from the web ( rate cuts , wars , </w:t>
+      </w:r>
       <w:r>
         <w:rPr>
           <w:color w:val="3A3A3A" w:themeColor="background2" w:themeShade="40"/>
         </w:rPr>
-        <w:t>( rate</w:t>
-      </w:r>
-      <w:proofErr w:type="gramEnd"/>
-      <w:r>
-        <w:rPr>
-          <w:color w:val="3A3A3A" w:themeColor="background2" w:themeShade="40"/>
-        </w:rPr>
-        <w:t xml:space="preserve"> </w:t>
-      </w:r>
-      <w:proofErr w:type="gramStart"/>
-      <w:r>
-        <w:rPr>
-          <w:color w:val="3A3A3A" w:themeColor="background2" w:themeShade="40"/>
-        </w:rPr>
-        <w:t>cuts ,</w:t>
-      </w:r>
-      <w:proofErr w:type="gramEnd"/>
-      <w:r>
-        <w:rPr>
-          <w:color w:val="3A3A3A" w:themeColor="background2" w:themeShade="40"/>
-        </w:rPr>
-        <w:t xml:space="preserve"> </w:t>
-      </w:r>
-      <w:proofErr w:type="gramStart"/>
-      <w:r>
-        <w:rPr>
-          <w:color w:val="3A3A3A" w:themeColor="background2" w:themeShade="40"/>
-        </w:rPr>
-        <w:t>wars ,</w:t>
-      </w:r>
-      <w:proofErr w:type="gramEnd"/>
-      <w:r>
-        <w:rPr>
-          <w:color w:val="3A3A3A" w:themeColor="background2" w:themeShade="40"/>
-        </w:rPr>
-        <w:t xml:space="preserve"> </w:t>
-      </w:r>
-      <w:r>
-        <w:rPr>
-          <w:color w:val="3A3A3A" w:themeColor="background2" w:themeShade="40"/>
-        </w:rPr>
-        <w:t xml:space="preserve">ETF </w:t>
-      </w:r>
-      <w:proofErr w:type="gramStart"/>
-      <w:r>
-        <w:rPr>
-          <w:color w:val="3A3A3A" w:themeColor="background2" w:themeShade="40"/>
-        </w:rPr>
-        <w:t>approval ,</w:t>
-      </w:r>
-      <w:proofErr w:type="gramEnd"/>
-      <w:r>
-        <w:rPr>
-          <w:color w:val="3A3A3A" w:themeColor="background2" w:themeShade="40"/>
-        </w:rPr>
-        <w:t xml:space="preserve"> </w:t>
-      </w:r>
-      <w:proofErr w:type="gramStart"/>
-      <w:r>
-        <w:rPr>
-          <w:color w:val="3A3A3A" w:themeColor="background2" w:themeShade="40"/>
-        </w:rPr>
-        <w:t>... )</w:t>
-      </w:r>
-      <w:proofErr w:type="gramEnd"/>
-      <w:r>
-        <w:rPr>
-          <w:color w:val="3A3A3A" w:themeColor="background2" w:themeShade="40"/>
-        </w:rPr>
-        <w:t xml:space="preserve"> </w:t>
+        <w:t xml:space="preserve">ETF approval , ... ) </w:t>
       </w:r>
     </w:p>
     <w:p>
@@ -412,21 +278,7 @@
         <w:rPr>
           <w:color w:val="3A3A3A" w:themeColor="background2" w:themeShade="40"/>
         </w:rPr>
-        <w:t xml:space="preserve">and answer </w:t>
-      </w:r>
-      <w:proofErr w:type="gramStart"/>
-      <w:r>
-        <w:rPr>
-          <w:color w:val="3A3A3A" w:themeColor="background2" w:themeShade="40"/>
-        </w:rPr>
-        <w:t>users</w:t>
-      </w:r>
-      <w:proofErr w:type="gramEnd"/>
-      <w:r>
-        <w:rPr>
-          <w:color w:val="3A3A3A" w:themeColor="background2" w:themeShade="40"/>
-        </w:rPr>
-        <w:t xml:space="preserve"> questions through a chatbot </w:t>
+        <w:t xml:space="preserve">and answer users questions through a chatbot </w:t>
       </w:r>
     </w:p>
     <w:p>
@@ -761,27 +613,13 @@
         <w:rPr>
           <w:color w:val="000000" w:themeColor="text1"/>
         </w:rPr>
-        <w:t xml:space="preserve"> the </w:t>
-      </w:r>
-      <w:proofErr w:type="gramStart"/>
-      <w:r>
-        <w:rPr>
-          <w:color w:val="000000" w:themeColor="text1"/>
-        </w:rPr>
-        <w:t>models</w:t>
-      </w:r>
-      <w:r>
-        <w:rPr>
-          <w:color w:val="000000" w:themeColor="text1"/>
-        </w:rPr>
-        <w:t xml:space="preserve"> ,</w:t>
-      </w:r>
-      <w:proofErr w:type="gramEnd"/>
-      <w:r>
-        <w:rPr>
-          <w:color w:val="000000" w:themeColor="text1"/>
-        </w:rPr>
-        <w:t xml:space="preserve"> and remain relevant as market conditions </w:t>
+        <w:t xml:space="preserve"> the models</w:t>
+      </w:r>
+      <w:r>
+        <w:rPr>
+          <w:color w:val="000000" w:themeColor="text1"/>
+        </w:rPr>
+        <w:t xml:space="preserve"> , and remain relevant as market conditions </w:t>
       </w:r>
       <w:r>
         <w:rPr>
@@ -821,7 +659,6 @@
           <w:color w:val="000000" w:themeColor="text1"/>
         </w:rPr>
       </w:pPr>
-      <w:proofErr w:type="gramStart"/>
       <w:r>
         <w:rPr>
           <w:b/>
@@ -836,16 +673,7 @@
           <w:bCs/>
           <w:color w:val="000000" w:themeColor="text1"/>
         </w:rPr>
-        <w:t>:</w:t>
-      </w:r>
-      <w:proofErr w:type="gramEnd"/>
-      <w:r>
-        <w:rPr>
-          <w:b/>
-          <w:bCs/>
-          <w:color w:val="000000" w:themeColor="text1"/>
-        </w:rPr>
-        <w:t xml:space="preserve"> </w:t>
+        <w:t xml:space="preserve">: </w:t>
       </w:r>
       <w:r>
         <w:rPr>
@@ -954,7 +782,6 @@
         </w:rPr>
         <w:t xml:space="preserve"> will use </w:t>
       </w:r>
-      <w:proofErr w:type="spellStart"/>
       <w:r>
         <w:rPr>
           <w:color w:val="000000" w:themeColor="text1"/>
@@ -965,68 +792,43 @@
         <w:rPr>
           <w:color w:val="000000" w:themeColor="text1"/>
         </w:rPr>
-        <w:t>data</w:t>
-      </w:r>
-      <w:proofErr w:type="spellEnd"/>
+        <w:t xml:space="preserve">data </w:t>
+      </w:r>
+    </w:p>
+    <w:p>
+      <w:pPr>
+        <w:rPr>
+          <w:b/>
+          <w:bCs/>
+          <w:color w:val="000000" w:themeColor="text1"/>
+        </w:rPr>
+      </w:pPr>
+    </w:p>
+    <w:p>
+      <w:pPr>
+        <w:rPr>
+          <w:color w:val="000000" w:themeColor="text1"/>
+        </w:rPr>
+      </w:pPr>
+      <w:r>
+        <w:rPr>
+          <w:b/>
+          <w:bCs/>
+          <w:color w:val="000000" w:themeColor="text1"/>
+        </w:rPr>
+        <w:t>Dataset source :</w:t>
+      </w:r>
       <w:r>
         <w:rPr>
           <w:color w:val="000000" w:themeColor="text1"/>
         </w:rPr>
         <w:t xml:space="preserve"> </w:t>
       </w:r>
-    </w:p>
-    <w:p>
-      <w:pPr>
-        <w:rPr>
-          <w:b/>
-          <w:bCs/>
-          <w:color w:val="000000" w:themeColor="text1"/>
-        </w:rPr>
-      </w:pPr>
-    </w:p>
-    <w:p>
-      <w:pPr>
-        <w:rPr>
-          <w:color w:val="000000" w:themeColor="text1"/>
-        </w:rPr>
-      </w:pPr>
-      <w:r>
-        <w:rPr>
-          <w:b/>
-          <w:bCs/>
-          <w:color w:val="000000" w:themeColor="text1"/>
-        </w:rPr>
-        <w:t xml:space="preserve">Dataset </w:t>
-      </w:r>
-      <w:proofErr w:type="gramStart"/>
-      <w:r>
-        <w:rPr>
-          <w:b/>
-          <w:bCs/>
-          <w:color w:val="000000" w:themeColor="text1"/>
-        </w:rPr>
-        <w:t>source :</w:t>
-      </w:r>
-      <w:proofErr w:type="gramEnd"/>
-      <w:r>
-        <w:rPr>
-          <w:color w:val="000000" w:themeColor="text1"/>
-        </w:rPr>
-        <w:t xml:space="preserve"> </w:t>
-      </w:r>
-      <w:proofErr w:type="spellStart"/>
-      <w:r>
-        <w:rPr>
-          <w:color w:val="000000" w:themeColor="text1"/>
-        </w:rPr>
-        <w:t>CoinGecko</w:t>
-      </w:r>
-      <w:proofErr w:type="spellEnd"/>
-      <w:r>
-        <w:rPr>
-          <w:color w:val="000000" w:themeColor="text1"/>
-        </w:rPr>
-        <w:t xml:space="preserve"> API</w:t>
+      <w:r>
+        <w:rPr>
+          <w:color w:val="000000" w:themeColor="text1"/>
+        </w:rPr>
+        <w:t>CoinGecko API</w:t>
       </w:r>
       <w:r>
         <w:rPr>
@@ -1084,15 +886,7 @@
         <w:rPr>
           <w:color w:val="000000" w:themeColor="text1"/>
         </w:rPr>
-        <w:t xml:space="preserve">urrent </w:t>
-      </w:r>
-      <w:proofErr w:type="spellStart"/>
-      <w:proofErr w:type="gramStart"/>
-      <w:r>
-        <w:rPr>
-          <w:color w:val="000000" w:themeColor="text1"/>
-        </w:rPr>
-        <w:t>price</w:t>
+        <w:t>urrent price</w:t>
       </w:r>
       <w:r>
         <w:rPr>
@@ -1104,22 +898,7 @@
         <w:rPr>
           <w:color w:val="000000" w:themeColor="text1"/>
         </w:rPr>
-        <w:t>Historical</w:t>
-      </w:r>
-      <w:proofErr w:type="spellEnd"/>
-      <w:proofErr w:type="gramEnd"/>
-      <w:r>
-        <w:rPr>
-          <w:color w:val="000000" w:themeColor="text1"/>
-        </w:rPr>
-        <w:t xml:space="preserve"> prices (daily, hourly</w:t>
-      </w:r>
-      <w:proofErr w:type="gramStart"/>
-      <w:r>
-        <w:rPr>
-          <w:color w:val="000000" w:themeColor="text1"/>
-        </w:rPr>
-        <w:t>)</w:t>
+        <w:t>Historical prices (daily, hourly)</w:t>
       </w:r>
       <w:r>
         <w:rPr>
@@ -1131,14 +910,7 @@
         <w:rPr>
           <w:color w:val="000000" w:themeColor="text1"/>
         </w:rPr>
-        <w:t>Market</w:t>
-      </w:r>
-      <w:proofErr w:type="gramEnd"/>
-      <w:r>
-        <w:rPr>
-          <w:color w:val="000000" w:themeColor="text1"/>
-        </w:rPr>
-        <w:t xml:space="preserve"> cap, volume</w:t>
+        <w:t>Market cap, volume</w:t>
       </w:r>
       <w:r>
         <w:rPr>
@@ -1195,14 +967,7 @@
         <w:rPr>
           <w:color w:val="000000" w:themeColor="text1"/>
         </w:rPr>
-        <w:t xml:space="preserve"> format: JSON → easy to convert to Pandas </w:t>
-      </w:r>
-      <w:proofErr w:type="spellStart"/>
-      <w:r>
-        <w:rPr>
-          <w:color w:val="000000" w:themeColor="text1"/>
-        </w:rPr>
-        <w:t>d</w:t>
+        <w:t xml:space="preserve"> format: JSON → easy to convert to Pandas d</w:t>
       </w:r>
       <w:r>
         <w:rPr>
@@ -1210,7 +975,6 @@
         </w:rPr>
         <w:t>f</w:t>
       </w:r>
-      <w:proofErr w:type="spellEnd"/>
       <w:r>
         <w:rPr>
           <w:color w:val="000000" w:themeColor="text1"/>
@@ -1284,21 +1048,7 @@
         <w:rPr>
           <w:color w:val="000000" w:themeColor="text1"/>
         </w:rPr>
-        <w:t xml:space="preserve">Altcoins </w:t>
-      </w:r>
-      <w:proofErr w:type="gramStart"/>
-      <w:r>
-        <w:rPr>
-          <w:color w:val="000000" w:themeColor="text1"/>
-        </w:rPr>
-        <w:t>index  or</w:t>
-      </w:r>
-      <w:proofErr w:type="gramEnd"/>
-      <w:r>
-        <w:rPr>
-          <w:color w:val="000000" w:themeColor="text1"/>
-        </w:rPr>
-        <w:t xml:space="preserve"> </w:t>
+        <w:t xml:space="preserve">Altcoins index  or </w:t>
       </w:r>
       <w:r>
         <w:rPr>
@@ -1365,89 +1115,19 @@
         <w:rPr>
           <w:color w:val="000000" w:themeColor="text1"/>
         </w:rPr>
-        <w:t xml:space="preserve">Descriptive </w:t>
-      </w:r>
-      <w:proofErr w:type="gramStart"/>
-      <w:r>
-        <w:rPr>
-          <w:color w:val="000000" w:themeColor="text1"/>
-        </w:rPr>
-        <w:t>statistic :</w:t>
-      </w:r>
-      <w:proofErr w:type="gramEnd"/>
-      <w:r>
-        <w:rPr>
-          <w:color w:val="000000" w:themeColor="text1"/>
-        </w:rPr>
-        <w:t xml:space="preserve"> mean, </w:t>
-      </w:r>
-      <w:proofErr w:type="gramStart"/>
-      <w:r>
-        <w:rPr>
-          <w:color w:val="000000" w:themeColor="text1"/>
-        </w:rPr>
-        <w:t>median ,</w:t>
-      </w:r>
-      <w:proofErr w:type="gramEnd"/>
-      <w:r>
-        <w:rPr>
-          <w:color w:val="000000" w:themeColor="text1"/>
-        </w:rPr>
-        <w:t xml:space="preserve"> standard deviation</w:t>
-      </w:r>
-      <w:r>
-        <w:rPr>
-          <w:color w:val="000000" w:themeColor="text1"/>
-        </w:rPr>
-        <w:t xml:space="preserve">, price vs </w:t>
-      </w:r>
-      <w:proofErr w:type="spellStart"/>
-      <w:r>
-        <w:rPr>
-          <w:color w:val="000000" w:themeColor="text1"/>
-        </w:rPr>
-        <w:t>marketcap</w:t>
-      </w:r>
-      <w:proofErr w:type="spellEnd"/>
-      <w:r>
-        <w:rPr>
-          <w:color w:val="000000" w:themeColor="text1"/>
-        </w:rPr>
-        <w:t xml:space="preserve">, </w:t>
-      </w:r>
-      <w:proofErr w:type="gramStart"/>
-      <w:r>
-        <w:rPr>
-          <w:color w:val="000000" w:themeColor="text1"/>
-        </w:rPr>
-        <w:t>whales</w:t>
-      </w:r>
-      <w:proofErr w:type="gramEnd"/>
-      <w:r>
-        <w:rPr>
-          <w:color w:val="000000" w:themeColor="text1"/>
-        </w:rPr>
-        <w:t xml:space="preserve"> movements, </w:t>
-      </w:r>
-      <w:proofErr w:type="gramStart"/>
-      <w:r>
-        <w:rPr>
-          <w:color w:val="000000" w:themeColor="text1"/>
-        </w:rPr>
-        <w:t xml:space="preserve">dominance </w:t>
-      </w:r>
-      <w:r>
-        <w:rPr>
-          <w:color w:val="000000" w:themeColor="text1"/>
-        </w:rPr>
-        <w:t xml:space="preserve"> ...</w:t>
-      </w:r>
-      <w:proofErr w:type="gramEnd"/>
-      <w:r>
-        <w:rPr>
-          <w:color w:val="000000" w:themeColor="text1"/>
-        </w:rPr>
-        <w:t xml:space="preserve"> </w:t>
+        <w:t>Descriptive statistic : mean, median , standard deviation</w:t>
+      </w:r>
+      <w:r>
+        <w:rPr>
+          <w:color w:val="000000" w:themeColor="text1"/>
+        </w:rPr>
+        <w:t xml:space="preserve">, price vs marketcap, whales movements, dominance </w:t>
+      </w:r>
+      <w:r>
+        <w:rPr>
+          <w:color w:val="000000" w:themeColor="text1"/>
+        </w:rPr>
+        <w:t xml:space="preserve"> ... </w:t>
       </w:r>
     </w:p>
     <w:p>
@@ -1464,21 +1144,7 @@
         <w:rPr>
           <w:color w:val="000000" w:themeColor="text1"/>
         </w:rPr>
-        <w:t xml:space="preserve">Time series analyse </w:t>
-      </w:r>
-      <w:proofErr w:type="gramStart"/>
-      <w:r>
-        <w:rPr>
-          <w:color w:val="000000" w:themeColor="text1"/>
-        </w:rPr>
-        <w:t>( important</w:t>
-      </w:r>
-      <w:proofErr w:type="gramEnd"/>
-      <w:r>
-        <w:rPr>
-          <w:color w:val="000000" w:themeColor="text1"/>
-        </w:rPr>
-        <w:t xml:space="preserve">) volatility and trend over time </w:t>
+        <w:t xml:space="preserve">Time series analyse ( important) volatility and trend over time </w:t>
       </w:r>
     </w:p>
     <w:p>
@@ -1495,35 +1161,7 @@
         <w:rPr>
           <w:color w:val="000000" w:themeColor="text1"/>
         </w:rPr>
-        <w:t xml:space="preserve">Price correlation </w:t>
-      </w:r>
-      <w:proofErr w:type="gramStart"/>
-      <w:r>
-        <w:rPr>
-          <w:color w:val="000000" w:themeColor="text1"/>
-        </w:rPr>
-        <w:t>( our</w:t>
-      </w:r>
-      <w:proofErr w:type="gramEnd"/>
-      <w:r>
-        <w:rPr>
-          <w:color w:val="000000" w:themeColor="text1"/>
-        </w:rPr>
-        <w:t xml:space="preserve"> </w:t>
-      </w:r>
-      <w:proofErr w:type="gramStart"/>
-      <w:r>
-        <w:rPr>
-          <w:color w:val="000000" w:themeColor="text1"/>
-        </w:rPr>
-        <w:t>target )</w:t>
-      </w:r>
-      <w:proofErr w:type="gramEnd"/>
-      <w:r>
-        <w:rPr>
-          <w:color w:val="000000" w:themeColor="text1"/>
-        </w:rPr>
-        <w:t xml:space="preserve"> </w:t>
+        <w:t xml:space="preserve">Price correlation ( our target ) </w:t>
       </w:r>
     </w:p>
     <w:p>
@@ -1540,108 +1178,30 @@
         <w:rPr>
           <w:color w:val="000000" w:themeColor="text1"/>
         </w:rPr>
-        <w:t xml:space="preserve">Classification by market </w:t>
-      </w:r>
-      <w:proofErr w:type="gramStart"/>
-      <w:r>
-        <w:rPr>
-          <w:color w:val="000000" w:themeColor="text1"/>
-        </w:rPr>
-        <w:t>cap ,</w:t>
-      </w:r>
-      <w:proofErr w:type="gramEnd"/>
-      <w:r>
-        <w:rPr>
-          <w:color w:val="000000" w:themeColor="text1"/>
-        </w:rPr>
-        <w:t xml:space="preserve"> </w:t>
-      </w:r>
-      <w:r>
-        <w:rPr>
-          <w:color w:val="000000" w:themeColor="text1"/>
-        </w:rPr>
-        <w:t xml:space="preserve">volatility </w:t>
-      </w:r>
-      <w:proofErr w:type="gramStart"/>
-      <w:r>
-        <w:rPr>
-          <w:color w:val="000000" w:themeColor="text1"/>
-        </w:rPr>
-        <w:t>( high</w:t>
-      </w:r>
-      <w:proofErr w:type="gramEnd"/>
-      <w:r>
-        <w:rPr>
-          <w:color w:val="000000" w:themeColor="text1"/>
-        </w:rPr>
-        <w:t xml:space="preserve"> , </w:t>
-      </w:r>
-      <w:proofErr w:type="gramStart"/>
-      <w:r>
-        <w:rPr>
-          <w:color w:val="000000" w:themeColor="text1"/>
-        </w:rPr>
-        <w:t>low )</w:t>
-      </w:r>
-      <w:proofErr w:type="gramEnd"/>
-      <w:r>
-        <w:rPr>
-          <w:color w:val="000000" w:themeColor="text1"/>
-        </w:rPr>
-        <w:t xml:space="preserve"> </w:t>
-      </w:r>
-    </w:p>
-    <w:p>
-      <w:pPr>
-        <w:rPr>
-          <w:b/>
-          <w:bCs/>
-          <w:color w:val="000000" w:themeColor="text1"/>
-        </w:rPr>
-      </w:pPr>
-      <w:r>
-        <w:rPr>
-          <w:b/>
-          <w:bCs/>
-          <w:color w:val="000000" w:themeColor="text1"/>
-        </w:rPr>
-        <w:t xml:space="preserve">At the end of the </w:t>
-      </w:r>
-      <w:proofErr w:type="gramStart"/>
-      <w:r>
-        <w:rPr>
-          <w:b/>
-          <w:bCs/>
-          <w:color w:val="000000" w:themeColor="text1"/>
-        </w:rPr>
-        <w:t>EDA</w:t>
-      </w:r>
-      <w:proofErr w:type="gramEnd"/>
-      <w:r>
-        <w:rPr>
-          <w:b/>
-          <w:bCs/>
-          <w:color w:val="000000" w:themeColor="text1"/>
-        </w:rPr>
-        <w:t xml:space="preserve"> we should be able to </w:t>
-      </w:r>
-      <w:proofErr w:type="gramStart"/>
-      <w:r>
-        <w:rPr>
-          <w:b/>
-          <w:bCs/>
-          <w:color w:val="000000" w:themeColor="text1"/>
-        </w:rPr>
-        <w:t>answer :</w:t>
-      </w:r>
-      <w:proofErr w:type="gramEnd"/>
-      <w:r>
-        <w:rPr>
-          <w:b/>
-          <w:bCs/>
-          <w:color w:val="000000" w:themeColor="text1"/>
-        </w:rPr>
-        <w:t xml:space="preserve"> </w:t>
+        <w:t xml:space="preserve">Classification by market cap , </w:t>
+      </w:r>
+      <w:r>
+        <w:rPr>
+          <w:color w:val="000000" w:themeColor="text1"/>
+        </w:rPr>
+        <w:t xml:space="preserve">volatility ( high , low ) </w:t>
+      </w:r>
+    </w:p>
+    <w:p>
+      <w:pPr>
+        <w:rPr>
+          <w:b/>
+          <w:bCs/>
+          <w:color w:val="000000" w:themeColor="text1"/>
+        </w:rPr>
+      </w:pPr>
+      <w:r>
+        <w:rPr>
+          <w:b/>
+          <w:bCs/>
+          <w:color w:val="000000" w:themeColor="text1"/>
+        </w:rPr>
+        <w:t xml:space="preserve">At the end of the EDA we should be able to answer : </w:t>
       </w:r>
     </w:p>
     <w:p>
@@ -1704,29 +1264,7 @@
           <w:sz w:val="32"/>
           <w:szCs w:val="32"/>
         </w:rPr>
-        <w:t xml:space="preserve">Models training challenges and </w:t>
-      </w:r>
-      <w:proofErr w:type="gramStart"/>
-      <w:r>
-        <w:rPr>
-          <w:b/>
-          <w:bCs/>
-          <w:color w:val="C00000"/>
-          <w:sz w:val="32"/>
-          <w:szCs w:val="32"/>
-        </w:rPr>
-        <w:t>solutions :</w:t>
-      </w:r>
-      <w:proofErr w:type="gramEnd"/>
-      <w:r>
-        <w:rPr>
-          <w:b/>
-          <w:bCs/>
-          <w:color w:val="C00000"/>
-          <w:sz w:val="32"/>
-          <w:szCs w:val="32"/>
-        </w:rPr>
-        <w:t xml:space="preserve"> </w:t>
+        <w:t xml:space="preserve">Models training challenges and solutions : </w:t>
       </w:r>
     </w:p>
     <w:p>
@@ -1853,37 +1391,12 @@
         </w:rPr>
         <w:t xml:space="preserve"> </w:t>
       </w:r>
-      <w:proofErr w:type="gramStart"/>
-      <w:r>
-        <w:rPr>
-          <w:b/>
-          <w:bCs/>
-        </w:rPr>
-        <w:t>( to</w:t>
-      </w:r>
-      <w:proofErr w:type="gramEnd"/>
-      <w:r>
-        <w:rPr>
-          <w:b/>
-          <w:bCs/>
-        </w:rPr>
-        <w:t xml:space="preserve"> discuss with </w:t>
-      </w:r>
-      <w:proofErr w:type="spellStart"/>
-      <w:r>
-        <w:rPr>
-          <w:b/>
-          <w:bCs/>
-        </w:rPr>
-        <w:t>Montassar</w:t>
-      </w:r>
-      <w:proofErr w:type="spellEnd"/>
-      <w:r>
-        <w:rPr>
-          <w:b/>
-          <w:bCs/>
-        </w:rPr>
-        <w:t xml:space="preserve">) </w:t>
+      <w:r>
+        <w:rPr>
+          <w:b/>
+          <w:bCs/>
+        </w:rPr>
+        <w:t xml:space="preserve">( to discuss with Montassar) </w:t>
       </w:r>
     </w:p>
     <w:p>
@@ -1956,26 +1469,10 @@
         <w:t>Fetch new data</w:t>
       </w:r>
       <w:r>
-        <w:t xml:space="preserve"> from </w:t>
-      </w:r>
-      <w:proofErr w:type="spellStart"/>
-      <w:r>
-        <w:t>coinGecko</w:t>
-      </w:r>
-      <w:proofErr w:type="spellEnd"/>
-      <w:r>
-        <w:t xml:space="preserve"> Api</w:t>
-      </w:r>
-      <w:r>
-        <w:t xml:space="preserve"> </w:t>
-      </w:r>
-      <w:proofErr w:type="gramStart"/>
-      <w:r>
-        <w:t>( daily</w:t>
-      </w:r>
-      <w:proofErr w:type="gramEnd"/>
-      <w:r>
-        <w:t xml:space="preserve"> </w:t>
+        <w:t xml:space="preserve"> from coinGecko Api</w:t>
+      </w:r>
+      <w:r>
+        <w:t xml:space="preserve"> ( daily </w:t>
       </w:r>
       <w:r>
         <w:t>)</w:t>
@@ -2036,23 +1533,7 @@
         <w:t>Track rolling error</w:t>
       </w:r>
       <w:r>
-        <w:t xml:space="preserve"> </w:t>
-      </w:r>
-      <w:proofErr w:type="gramStart"/>
-      <w:r>
-        <w:t>( ex</w:t>
-      </w:r>
-      <w:proofErr w:type="gramEnd"/>
-      <w:r>
-        <w:t xml:space="preserve"> last 30 </w:t>
-      </w:r>
-      <w:proofErr w:type="gramStart"/>
-      <w:r>
-        <w:t>days )</w:t>
-      </w:r>
-      <w:proofErr w:type="gramEnd"/>
-      <w:r>
-        <w:t xml:space="preserve"> </w:t>
+        <w:t xml:space="preserve"> ( ex last 30 days ) </w:t>
       </w:r>
     </w:p>
     <w:p>
@@ -2071,23 +1552,7 @@
         <w:t>retraining</w:t>
       </w:r>
       <w:r>
-        <w:t xml:space="preserve"> is needed </w:t>
-      </w:r>
-      <w:proofErr w:type="gramStart"/>
-      <w:r>
-        <w:t>( if</w:t>
-      </w:r>
-      <w:proofErr w:type="gramEnd"/>
-      <w:r>
-        <w:t xml:space="preserve"> the error rate exceeds certain </w:t>
-      </w:r>
-      <w:proofErr w:type="gramStart"/>
-      <w:r>
-        <w:t>threshold )</w:t>
-      </w:r>
-      <w:proofErr w:type="gramEnd"/>
-      <w:r>
-        <w:t xml:space="preserve"> </w:t>
+        <w:t xml:space="preserve"> is needed ( if the error rate exceeds certain threshold ) </w:t>
       </w:r>
     </w:p>
     <w:p>
@@ -2109,17 +1574,8 @@
           <w:b/>
           <w:bCs/>
         </w:rPr>
-        <w:t xml:space="preserve">DB </w:t>
-      </w:r>
-      <w:proofErr w:type="gramStart"/>
-      <w:r>
-        <w:rPr>
-          <w:b/>
-          <w:bCs/>
-        </w:rPr>
-        <w:t>type :</w:t>
-      </w:r>
-      <w:proofErr w:type="gramEnd"/>
+        <w:t>DB type :</w:t>
+      </w:r>
       <w:r>
         <w:t xml:space="preserve"> </w:t>
       </w:r>
@@ -2148,28 +1604,17 @@
           <w:b/>
           <w:bCs/>
         </w:rPr>
-        <w:t xml:space="preserve">Expected </w:t>
-      </w:r>
-      <w:proofErr w:type="gramStart"/>
-      <w:r>
-        <w:rPr>
-          <w:b/>
-          <w:bCs/>
-        </w:rPr>
-        <w:t>size :</w:t>
-      </w:r>
-      <w:proofErr w:type="gramEnd"/>
+        <w:t>Expected size :</w:t>
+      </w:r>
       <w:r>
         <w:t xml:space="preserve"> </w:t>
       </w:r>
       <w:r>
         <w:t xml:space="preserve">If </w:t>
       </w:r>
-      <w:proofErr w:type="spellStart"/>
       <w:r>
         <w:t>i</w:t>
       </w:r>
-      <w:proofErr w:type="spellEnd"/>
       <w:r>
         <w:t xml:space="preserve"> store 1 coin hourly for 5 years: </w:t>
       </w:r>
@@ -2220,23 +1665,7 @@
           <w:b/>
           <w:bCs/>
         </w:rPr>
-        <w:t xml:space="preserve">Tables to </w:t>
-      </w:r>
-      <w:proofErr w:type="gramStart"/>
-      <w:r>
-        <w:rPr>
-          <w:b/>
-          <w:bCs/>
-        </w:rPr>
-        <w:t>store :</w:t>
-      </w:r>
-      <w:proofErr w:type="gramEnd"/>
-      <w:r>
-        <w:rPr>
-          <w:b/>
-          <w:bCs/>
-        </w:rPr>
-        <w:t xml:space="preserve"> </w:t>
+        <w:t xml:space="preserve">Tables to store : </w:t>
       </w:r>
     </w:p>
     <w:p>
@@ -2248,15 +1677,7 @@
         </w:numPr>
       </w:pPr>
       <w:r>
-        <w:t xml:space="preserve">raw price -&gt; daily live prices fetched from </w:t>
-      </w:r>
-      <w:proofErr w:type="spellStart"/>
-      <w:r>
-        <w:t>coinGeko</w:t>
-      </w:r>
-      <w:proofErr w:type="spellEnd"/>
-      <w:r>
-        <w:t xml:space="preserve"> </w:t>
+        <w:t xml:space="preserve">raw price -&gt; daily live prices fetched from coinGeko </w:t>
       </w:r>
     </w:p>
     <w:p>
@@ -2291,39 +1712,7 @@
         <w:t>Timestamps</w:t>
       </w:r>
       <w:r>
-        <w:t xml:space="preserve"> are important every prediction should be related to a target timestamp to know when the new data is </w:t>
-      </w:r>
-      <w:proofErr w:type="gramStart"/>
-      <w:r>
-        <w:t>available ,</w:t>
-      </w:r>
-      <w:proofErr w:type="gramEnd"/>
-      <w:r>
-        <w:t xml:space="preserve"> example target timestamp is tomorrow we store </w:t>
-      </w:r>
-      <w:proofErr w:type="gramStart"/>
-      <w:r>
-        <w:t>it’s</w:t>
-      </w:r>
-      <w:proofErr w:type="gramEnd"/>
-      <w:r>
-        <w:t xml:space="preserve"> prediction today and save it in the prediction </w:t>
-      </w:r>
-      <w:proofErr w:type="gramStart"/>
-      <w:r>
-        <w:t>table .</w:t>
-      </w:r>
-      <w:proofErr w:type="gramEnd"/>
-      <w:r>
-        <w:t xml:space="preserve"> when tomorrows closing price is available in the raw price table e make the </w:t>
-      </w:r>
-      <w:proofErr w:type="gramStart"/>
-      <w:r>
-        <w:t>comparison ,</w:t>
-      </w:r>
-      <w:proofErr w:type="gramEnd"/>
-      <w:r>
-        <w:t xml:space="preserve"> calculate the error and store it in errors table </w:t>
+        <w:t xml:space="preserve"> are important every prediction should be related to a target timestamp to know when the new data is available , example target timestamp is tomorrow we store it’s prediction today and save it in the prediction table . when tomorrows closing price is available in the raw price table e make the comparison , calculate the error and store it in errors table </w:t>
       </w:r>
     </w:p>
     <w:p>
@@ -2338,7 +1727,6 @@
           <w:bCs/>
         </w:rPr>
       </w:pPr>
-      <w:proofErr w:type="gramStart"/>
       <w:r>
         <w:rPr>
           <w:b/>
@@ -2351,15 +1739,7 @@
           <w:b/>
           <w:bCs/>
         </w:rPr>
-        <w:t xml:space="preserve"> :</w:t>
-      </w:r>
-      <w:proofErr w:type="gramEnd"/>
-      <w:r>
-        <w:rPr>
-          <w:b/>
-          <w:bCs/>
-        </w:rPr>
-        <w:t xml:space="preserve"> </w:t>
+        <w:t xml:space="preserve"> : </w:t>
       </w:r>
     </w:p>
     <w:p>
@@ -2376,15 +1756,7 @@
         <w:pStyle w:val="ListParagraph"/>
       </w:pPr>
       <w:r>
-        <w:t>[</w:t>
-      </w:r>
-      <w:proofErr w:type="spellStart"/>
-      <w:r>
-        <w:t>CoinGecko</w:t>
-      </w:r>
-      <w:proofErr w:type="spellEnd"/>
-      <w:r>
-        <w:t xml:space="preserve"> API] </w:t>
+        <w:t xml:space="preserve">[CoinGecko API] </w:t>
       </w:r>
     </w:p>
     <w:p>
@@ -2414,15 +1786,7 @@
         <w:pStyle w:val="ListParagraph"/>
       </w:pPr>
       <w:r>
-        <w:t xml:space="preserve">  </w:t>
-      </w:r>
-      <w:proofErr w:type="spellStart"/>
-      <w:r>
-        <w:t>raw_prices</w:t>
-      </w:r>
-      <w:proofErr w:type="spellEnd"/>
-      <w:r>
-        <w:t xml:space="preserve"> table</w:t>
+        <w:t xml:space="preserve">  raw_prices table</w:t>
       </w:r>
     </w:p>
     <w:p>
@@ -2482,31 +1846,7 @@
         <w:pStyle w:val="ListParagraph"/>
       </w:pPr>
       <w:r>
-        <w:t xml:space="preserve">Compare </w:t>
-      </w:r>
-      <w:proofErr w:type="spellStart"/>
-      <w:r>
-        <w:t>predicted_price</w:t>
-      </w:r>
-      <w:proofErr w:type="spellEnd"/>
-      <w:r>
-        <w:t xml:space="preserve"> with </w:t>
-      </w:r>
-      <w:proofErr w:type="spellStart"/>
-      <w:r>
-        <w:t>true_price</w:t>
-      </w:r>
-      <w:proofErr w:type="spellEnd"/>
-      <w:r>
-        <w:t xml:space="preserve"> (from </w:t>
-      </w:r>
-      <w:proofErr w:type="spellStart"/>
-      <w:r>
-        <w:t>raw_prices</w:t>
-      </w:r>
-      <w:proofErr w:type="spellEnd"/>
-      <w:r>
-        <w:t>)</w:t>
+        <w:t>Compare predicted_price with true_price (from raw_prices)</w:t>
       </w:r>
     </w:p>
     <w:p>
@@ -2566,15 +1906,7 @@
         <w:pStyle w:val="ListParagraph"/>
       </w:pPr>
       <w:r>
-        <w:t xml:space="preserve">If rolling error &gt; threshold → </w:t>
-      </w:r>
-      <w:proofErr w:type="spellStart"/>
-      <w:r>
-        <w:t>retraining_log</w:t>
-      </w:r>
-      <w:proofErr w:type="spellEnd"/>
-      <w:r>
-        <w:t xml:space="preserve"> table → retrain model</w:t>
+        <w:t>If rolling error &gt; threshold → retraining_log table → retrain model</w:t>
       </w:r>
     </w:p>
     <w:p>
@@ -2605,31 +1937,7 @@
         <w:sym w:font="Wingdings" w:char="F0E0"/>
       </w:r>
       <w:r>
-        <w:t xml:space="preserve"> the prediction should be done using as input the live </w:t>
-      </w:r>
-      <w:proofErr w:type="gramStart"/>
-      <w:r>
-        <w:t>data ,</w:t>
-      </w:r>
-      <w:proofErr w:type="gramEnd"/>
-      <w:r>
-        <w:t xml:space="preserve"> the user is not supposed to enter manually technical data to get the response </w:t>
-      </w:r>
-      <w:proofErr w:type="gramStart"/>
-      <w:r>
-        <w:t>( what</w:t>
-      </w:r>
-      <w:proofErr w:type="gramEnd"/>
-      <w:r>
-        <w:t xml:space="preserve"> is the prediction for BTC </w:t>
-      </w:r>
-      <w:proofErr w:type="gramStart"/>
-      <w:r>
-        <w:t>tomorrow )</w:t>
-      </w:r>
-      <w:proofErr w:type="gramEnd"/>
-      <w:r>
-        <w:t xml:space="preserve"> </w:t>
+        <w:t xml:space="preserve"> the prediction should be done using as input the live data , the user is not supposed to enter manually technical data to get the response ( what is the prediction for BTC tomorrow ) </w:t>
       </w:r>
     </w:p>
     <w:p>
@@ -2689,15 +1997,7 @@
         <w:ind w:left="1800"/>
       </w:pPr>
       <w:r>
-        <w:t>Fetch live data from a crypto API (</w:t>
-      </w:r>
-      <w:proofErr w:type="spellStart"/>
-      <w:r>
-        <w:t>CoinGecko</w:t>
-      </w:r>
-      <w:proofErr w:type="spellEnd"/>
-      <w:r>
-        <w:t>)</w:t>
+        <w:t>Fetch live data from a crypto API (CoinGecko)</w:t>
       </w:r>
     </w:p>
     <w:p>
@@ -2710,13 +2010,8 @@
         <w:ind w:left="1800"/>
       </w:pPr>
       <w:r>
-        <w:t xml:space="preserve">Preprocess the data and compute technical indicators </w:t>
-      </w:r>
-      <w:proofErr w:type="gramStart"/>
-      <w:r>
-        <w:t>( RSI ..</w:t>
-      </w:r>
-      <w:proofErr w:type="gramEnd"/>
+        <w:t>Preprocess the data and compute technical indicators ( RSI ..</w:t>
+      </w:r>
       <w:r>
         <w:t xml:space="preserve">) the ones we added in the EDA part </w:t>
       </w:r>
@@ -2805,35 +2100,13 @@
         <w:rPr>
           <w:color w:val="000000" w:themeColor="text1"/>
         </w:rPr>
-        <w:t xml:space="preserve">Price prediction using different </w:t>
-      </w:r>
-      <w:proofErr w:type="gramStart"/>
-      <w:r>
-        <w:rPr>
-          <w:color w:val="000000" w:themeColor="text1"/>
-        </w:rPr>
-        <w:t>models</w:t>
-      </w:r>
-      <w:proofErr w:type="gramEnd"/>
-      <w:r>
-        <w:rPr>
-          <w:color w:val="000000" w:themeColor="text1"/>
-        </w:rPr>
-        <w:t xml:space="preserve"> </w:t>
-      </w:r>
-      <w:proofErr w:type="gramStart"/>
-      <w:r>
-        <w:rPr>
-          <w:color w:val="000000" w:themeColor="text1"/>
-        </w:rPr>
-        <w:t>ex :</w:t>
-      </w:r>
-      <w:proofErr w:type="gramEnd"/>
-      <w:r>
-        <w:rPr>
-          <w:color w:val="000000" w:themeColor="text1"/>
-        </w:rPr>
-        <w:t xml:space="preserve"> </w:t>
+        <w:t xml:space="preserve">Price prediction using different models </w:t>
+      </w:r>
+      <w:r>
+        <w:rPr>
+          <w:color w:val="000000" w:themeColor="text1"/>
+        </w:rPr>
+        <w:t xml:space="preserve">ex : </w:t>
       </w:r>
     </w:p>
     <w:p>
@@ -2880,19 +2153,11 @@
           <w:color w:val="000000" w:themeColor="text1"/>
         </w:rPr>
       </w:pPr>
-      <w:proofErr w:type="spellStart"/>
-      <w:r>
-        <w:rPr>
-          <w:color w:val="000000" w:themeColor="text1"/>
-        </w:rPr>
-        <w:t>XGBoost</w:t>
-      </w:r>
-      <w:proofErr w:type="spellEnd"/>
-      <w:r>
-        <w:rPr>
-          <w:color w:val="000000" w:themeColor="text1"/>
-        </w:rPr>
-        <w:t xml:space="preserve"> Regressor</w:t>
+      <w:r>
+        <w:rPr>
+          <w:color w:val="000000" w:themeColor="text1"/>
+        </w:rPr>
+        <w:t>XGBoost Regressor</w:t>
       </w:r>
       <w:r>
         <w:rPr>
@@ -2911,16 +2176,8 @@
         <w:rPr>
           <w:color w:val="000000" w:themeColor="text1"/>
         </w:rPr>
-        <w:t xml:space="preserve">Choose the best performance and make a deep evaluation of </w:t>
-      </w:r>
-      <w:proofErr w:type="gramStart"/>
-      <w:r>
-        <w:rPr>
-          <w:color w:val="000000" w:themeColor="text1"/>
-        </w:rPr>
-        <w:t>it :</w:t>
-      </w:r>
-      <w:proofErr w:type="gramEnd"/>
+        <w:t>Choose the best performance and make a deep evaluation of it :</w:t>
+      </w:r>
     </w:p>
     <w:p>
       <w:pPr>
@@ -3077,29 +2334,7 @@
           <w:sz w:val="32"/>
           <w:szCs w:val="32"/>
         </w:rPr>
-        <w:t xml:space="preserve">Deep Learning with Long Short-Term Memory </w:t>
-      </w:r>
-      <w:proofErr w:type="gramStart"/>
-      <w:r>
-        <w:rPr>
-          <w:b/>
-          <w:bCs/>
-          <w:color w:val="C00000"/>
-          <w:sz w:val="32"/>
-          <w:szCs w:val="32"/>
-        </w:rPr>
-        <w:t>( important</w:t>
-      </w:r>
-      <w:proofErr w:type="gramEnd"/>
-      <w:r>
-        <w:rPr>
-          <w:b/>
-          <w:bCs/>
-          <w:color w:val="C00000"/>
-          <w:sz w:val="32"/>
-          <w:szCs w:val="32"/>
-        </w:rPr>
-        <w:t xml:space="preserve"> ) </w:t>
+        <w:t xml:space="preserve">Deep Learning with Long Short-Term Memory ( important ) </w:t>
       </w:r>
     </w:p>
     <w:p>
@@ -3139,21 +2374,7 @@
         <w:rPr>
           <w:color w:val="000000" w:themeColor="text1"/>
         </w:rPr>
-        <w:t xml:space="preserve">To predict the future </w:t>
-      </w:r>
-      <w:proofErr w:type="gramStart"/>
-      <w:r>
-        <w:rPr>
-          <w:color w:val="000000" w:themeColor="text1"/>
-        </w:rPr>
-        <w:t>price ,we</w:t>
-      </w:r>
-      <w:proofErr w:type="gramEnd"/>
-      <w:r>
-        <w:rPr>
-          <w:color w:val="000000" w:themeColor="text1"/>
-        </w:rPr>
-        <w:t xml:space="preserve"> need to train the model on a long history of prices </w:t>
+        <w:t xml:space="preserve">To predict the future price ,we need to train the model on a long history of prices </w:t>
       </w:r>
     </w:p>
     <w:p>
@@ -3220,21 +2441,7 @@
         <w:rPr>
           <w:color w:val="000000" w:themeColor="text1"/>
         </w:rPr>
-        <w:t>Normalize features (</w:t>
-      </w:r>
-      <w:proofErr w:type="spellStart"/>
-      <w:r>
-        <w:rPr>
-          <w:color w:val="000000" w:themeColor="text1"/>
-        </w:rPr>
-        <w:t>MinMaxScaler</w:t>
-      </w:r>
-      <w:proofErr w:type="spellEnd"/>
-      <w:r>
-        <w:rPr>
-          <w:color w:val="000000" w:themeColor="text1"/>
-        </w:rPr>
-        <w:t>)</w:t>
+        <w:t>Normalize features (MinMaxScaler)</w:t>
       </w:r>
     </w:p>
     <w:p>
@@ -3257,21 +2464,7 @@
         <w:rPr>
           <w:color w:val="000000" w:themeColor="text1"/>
         </w:rPr>
-        <w:t xml:space="preserve"> example look to the n=3 last days to predict </w:t>
-      </w:r>
-      <w:proofErr w:type="gramStart"/>
-      <w:r>
-        <w:rPr>
-          <w:color w:val="000000" w:themeColor="text1"/>
-        </w:rPr>
-        <w:t>tomorrows</w:t>
-      </w:r>
-      <w:proofErr w:type="gramEnd"/>
-      <w:r>
-        <w:rPr>
-          <w:color w:val="000000" w:themeColor="text1"/>
-        </w:rPr>
-        <w:t xml:space="preserve"> price </w:t>
+        <w:t xml:space="preserve"> example look to the n=3 last days to predict tomorrows price </w:t>
       </w:r>
     </w:p>
     <w:p>
@@ -3429,27 +2622,13 @@
         <w:rPr>
           <w:color w:val="000000" w:themeColor="text1"/>
         </w:rPr>
-        <w:t xml:space="preserve">The output </w:t>
-      </w:r>
-      <w:proofErr w:type="gramStart"/>
-      <w:r>
-        <w:rPr>
-          <w:color w:val="000000" w:themeColor="text1"/>
-        </w:rPr>
-        <w:t xml:space="preserve">of  </w:t>
-      </w:r>
-      <w:r>
-        <w:rPr>
-          <w:color w:val="000000" w:themeColor="text1"/>
-        </w:rPr>
-        <w:t>the</w:t>
-      </w:r>
-      <w:proofErr w:type="gramEnd"/>
-      <w:r>
-        <w:rPr>
-          <w:color w:val="000000" w:themeColor="text1"/>
-        </w:rPr>
-        <w:t xml:space="preserve"> deep learning</w:t>
+        <w:t xml:space="preserve">The output of  </w:t>
+      </w:r>
+      <w:r>
+        <w:rPr>
+          <w:color w:val="000000" w:themeColor="text1"/>
+        </w:rPr>
+        <w:t>the deep learning</w:t>
       </w:r>
       <w:r>
         <w:rPr>
@@ -3463,7 +2642,6 @@
         </w:rPr>
         <w:t xml:space="preserve"> </w:t>
       </w:r>
-      <w:proofErr w:type="gramStart"/>
       <w:r>
         <w:rPr>
           <w:color w:val="000000" w:themeColor="text1"/>
@@ -3474,14 +2652,7 @@
         <w:rPr>
           <w:color w:val="000000" w:themeColor="text1"/>
         </w:rPr>
-        <w:t>real</w:t>
-      </w:r>
-      <w:proofErr w:type="gramEnd"/>
-      <w:r>
-        <w:rPr>
-          <w:color w:val="000000" w:themeColor="text1"/>
-        </w:rPr>
-        <w:t xml:space="preserve"> time </w:t>
+        <w:t xml:space="preserve">real time </w:t>
       </w:r>
       <w:r>
         <w:rPr>
@@ -3522,136 +2693,44 @@
         <w:rPr>
           <w:color w:val="000000" w:themeColor="text1"/>
         </w:rPr>
-        <w:t>xternal context (</w:t>
-      </w:r>
-      <w:proofErr w:type="gramStart"/>
-      <w:r>
-        <w:rPr>
-          <w:color w:val="000000" w:themeColor="text1"/>
-        </w:rPr>
-        <w:t>politics</w:t>
-      </w:r>
-      <w:r>
-        <w:rPr>
-          <w:color w:val="000000" w:themeColor="text1"/>
-        </w:rPr>
-        <w:t xml:space="preserve"> ,</w:t>
-      </w:r>
-      <w:proofErr w:type="gramEnd"/>
+        <w:t>xternal context (politics</w:t>
+      </w:r>
+      <w:r>
+        <w:rPr>
+          <w:color w:val="000000" w:themeColor="text1"/>
+        </w:rPr>
+        <w:t xml:space="preserve"> , wars </w:t>
+      </w:r>
+      <w:r>
+        <w:rPr>
+          <w:color w:val="000000" w:themeColor="text1"/>
+        </w:rPr>
+        <w:t>, regulation</w:t>
+      </w:r>
+      <w:r>
+        <w:rPr>
+          <w:color w:val="000000" w:themeColor="text1"/>
+        </w:rPr>
+        <w:t xml:space="preserve"> , tax politique , interest rate cuts </w:t>
+      </w:r>
+      <w:r>
+        <w:rPr>
+          <w:color w:val="000000" w:themeColor="text1"/>
+        </w:rPr>
+        <w:t>, macroeconomics, major news)</w:t>
+      </w:r>
       <w:r>
         <w:rPr>
           <w:color w:val="000000" w:themeColor="text1"/>
         </w:rPr>
         <w:t xml:space="preserve"> </w:t>
       </w:r>
-      <w:proofErr w:type="gramStart"/>
-      <w:r>
-        <w:rPr>
-          <w:color w:val="000000" w:themeColor="text1"/>
-        </w:rPr>
-        <w:t xml:space="preserve">wars </w:t>
-      </w:r>
-      <w:r>
-        <w:rPr>
-          <w:color w:val="000000" w:themeColor="text1"/>
-        </w:rPr>
-        <w:t>,</w:t>
-      </w:r>
-      <w:proofErr w:type="gramEnd"/>
-      <w:r>
-        <w:rPr>
-          <w:color w:val="000000" w:themeColor="text1"/>
-        </w:rPr>
-        <w:t xml:space="preserve"> </w:t>
-      </w:r>
-      <w:proofErr w:type="gramStart"/>
-      <w:r>
-        <w:rPr>
-          <w:color w:val="000000" w:themeColor="text1"/>
-        </w:rPr>
-        <w:t>regulation</w:t>
-      </w:r>
-      <w:r>
-        <w:rPr>
-          <w:color w:val="000000" w:themeColor="text1"/>
-        </w:rPr>
-        <w:t xml:space="preserve"> ,</w:t>
-      </w:r>
-      <w:proofErr w:type="gramEnd"/>
-      <w:r>
-        <w:rPr>
-          <w:color w:val="000000" w:themeColor="text1"/>
-        </w:rPr>
-        <w:t xml:space="preserve"> tax </w:t>
-      </w:r>
-      <w:proofErr w:type="gramStart"/>
-      <w:r>
-        <w:rPr>
-          <w:color w:val="000000" w:themeColor="text1"/>
-        </w:rPr>
-        <w:t>politique ,</w:t>
-      </w:r>
-      <w:proofErr w:type="gramEnd"/>
-      <w:r>
-        <w:rPr>
-          <w:color w:val="000000" w:themeColor="text1"/>
-        </w:rPr>
-        <w:t xml:space="preserve"> interest rate </w:t>
-      </w:r>
-      <w:proofErr w:type="gramStart"/>
-      <w:r>
-        <w:rPr>
-          <w:color w:val="000000" w:themeColor="text1"/>
-        </w:rPr>
-        <w:t xml:space="preserve">cuts </w:t>
-      </w:r>
-      <w:r>
-        <w:rPr>
-          <w:color w:val="000000" w:themeColor="text1"/>
-        </w:rPr>
-        <w:t>,</w:t>
-      </w:r>
-      <w:proofErr w:type="gramEnd"/>
-      <w:r>
-        <w:rPr>
-          <w:color w:val="000000" w:themeColor="text1"/>
-        </w:rPr>
-        <w:t xml:space="preserve"> macroeconomics, major news)</w:t>
-      </w:r>
-      <w:r>
-        <w:rPr>
-          <w:color w:val="000000" w:themeColor="text1"/>
-        </w:rPr>
-        <w:t xml:space="preserve"> </w:t>
-      </w:r>
-      <w:r>
-        <w:rPr>
-          <w:color w:val="000000" w:themeColor="text1"/>
-        </w:rPr>
-        <w:t xml:space="preserve">from the web </w:t>
-      </w:r>
-      <w:proofErr w:type="gramStart"/>
-      <w:r>
-        <w:rPr>
-          <w:color w:val="000000" w:themeColor="text1"/>
-        </w:rPr>
-        <w:t>( very</w:t>
-      </w:r>
-      <w:proofErr w:type="gramEnd"/>
-      <w:r>
-        <w:rPr>
-          <w:color w:val="000000" w:themeColor="text1"/>
-        </w:rPr>
-        <w:t xml:space="preserve"> </w:t>
-      </w:r>
-      <w:proofErr w:type="gramStart"/>
-      <w:r>
-        <w:rPr>
-          <w:color w:val="000000" w:themeColor="text1"/>
-        </w:rPr>
-        <w:t>important )</w:t>
-      </w:r>
-      <w:proofErr w:type="gramEnd"/>
+      <w:r>
+        <w:rPr>
+          <w:color w:val="000000" w:themeColor="text1"/>
+        </w:rPr>
+        <w:t>from the web ( very important )</w:t>
+      </w:r>
     </w:p>
     <w:p>
       <w:pPr>
@@ -3698,32 +2777,21 @@
           <w:color w:val="000000" w:themeColor="text1"/>
         </w:rPr>
       </w:pPr>
-      <w:proofErr w:type="gramStart"/>
-      <w:r>
-        <w:rPr>
-          <w:b/>
-          <w:bCs/>
-          <w:color w:val="000000" w:themeColor="text1"/>
-        </w:rPr>
-        <w:t>Example :</w:t>
-      </w:r>
-      <w:proofErr w:type="gramEnd"/>
-      <w:r>
-        <w:rPr>
-          <w:b/>
-          <w:bCs/>
-          <w:color w:val="000000" w:themeColor="text1"/>
-        </w:rPr>
-        <w:t xml:space="preserve"> </w:t>
-      </w:r>
-    </w:p>
-    <w:p>
-      <w:pPr>
-        <w:rPr>
-          <w:color w:val="000000" w:themeColor="text1"/>
-        </w:rPr>
-      </w:pPr>
-      <w:proofErr w:type="gramStart"/>
+      <w:r>
+        <w:rPr>
+          <w:b/>
+          <w:bCs/>
+          <w:color w:val="000000" w:themeColor="text1"/>
+        </w:rPr>
+        <w:t xml:space="preserve">Example : </w:t>
+      </w:r>
+    </w:p>
+    <w:p>
+      <w:pPr>
+        <w:rPr>
+          <w:color w:val="000000" w:themeColor="text1"/>
+        </w:rPr>
+      </w:pPr>
       <w:r>
         <w:rPr>
           <w:b/>
@@ -3732,35 +2800,19 @@
         </w:rPr>
         <w:t>Question :</w:t>
       </w:r>
-      <w:proofErr w:type="gramEnd"/>
-      <w:r>
-        <w:rPr>
-          <w:color w:val="000000" w:themeColor="text1"/>
-        </w:rPr>
-        <w:t xml:space="preserve"> what are bitcoin predictions this </w:t>
-      </w:r>
-      <w:proofErr w:type="gramStart"/>
-      <w:r>
-        <w:rPr>
-          <w:color w:val="000000" w:themeColor="text1"/>
-        </w:rPr>
-        <w:t>week ?</w:t>
-      </w:r>
-      <w:proofErr w:type="gramEnd"/>
-      <w:r>
-        <w:rPr>
-          <w:color w:val="000000" w:themeColor="text1"/>
-        </w:rPr>
-        <w:t xml:space="preserve"> </w:t>
-      </w:r>
-    </w:p>
-    <w:p>
-      <w:pPr>
-        <w:rPr>
-          <w:color w:val="000000" w:themeColor="text1"/>
-        </w:rPr>
-      </w:pPr>
-      <w:proofErr w:type="gramStart"/>
+      <w:r>
+        <w:rPr>
+          <w:color w:val="000000" w:themeColor="text1"/>
+        </w:rPr>
+        <w:t xml:space="preserve"> what are bitcoin predictions this week ? </w:t>
+      </w:r>
+    </w:p>
+    <w:p>
+      <w:pPr>
+        <w:rPr>
+          <w:color w:val="000000" w:themeColor="text1"/>
+        </w:rPr>
+      </w:pPr>
       <w:r>
         <w:rPr>
           <w:b/>
@@ -3769,7 +2821,6 @@
         </w:rPr>
         <w:t>Response :</w:t>
       </w:r>
-      <w:proofErr w:type="gramEnd"/>
       <w:r>
         <w:rPr>
           <w:color w:val="000000" w:themeColor="text1"/>
@@ -3823,25 +2874,7 @@
           <w:bCs/>
           <w:color w:val="000000" w:themeColor="text1"/>
         </w:rPr>
-        <w:t xml:space="preserve">Pipeline looks like </w:t>
-      </w:r>
-      <w:proofErr w:type="gramStart"/>
-      <w:r>
-        <w:rPr>
-          <w:b/>
-          <w:bCs/>
-          <w:color w:val="000000" w:themeColor="text1"/>
-        </w:rPr>
-        <w:t>this :</w:t>
-      </w:r>
-      <w:proofErr w:type="gramEnd"/>
-      <w:r>
-        <w:rPr>
-          <w:b/>
-          <w:bCs/>
-          <w:color w:val="000000" w:themeColor="text1"/>
-        </w:rPr>
-        <w:t xml:space="preserve"> </w:t>
+        <w:t xml:space="preserve">Pipeline looks like this : </w:t>
       </w:r>
     </w:p>
     <w:p>
@@ -3880,41 +2913,13 @@
         <w:rPr>
           <w:color w:val="000000" w:themeColor="text1"/>
         </w:rPr>
-        <w:t>Fetch latest crypto data (</w:t>
-      </w:r>
-      <w:proofErr w:type="spellStart"/>
-      <w:r>
-        <w:rPr>
-          <w:color w:val="000000" w:themeColor="text1"/>
-        </w:rPr>
-        <w:t>CoinGecko</w:t>
-      </w:r>
-      <w:proofErr w:type="spellEnd"/>
-      <w:r>
-        <w:rPr>
-          <w:color w:val="000000" w:themeColor="text1"/>
-        </w:rPr>
-        <w:t>)</w:t>
-      </w:r>
-      <w:r>
-        <w:rPr>
-          <w:color w:val="000000" w:themeColor="text1"/>
-        </w:rPr>
-        <w:t xml:space="preserve"> we use crypto </w:t>
-      </w:r>
-      <w:proofErr w:type="spellStart"/>
-      <w:r>
-        <w:rPr>
-          <w:color w:val="000000" w:themeColor="text1"/>
-        </w:rPr>
-        <w:t>api</w:t>
-      </w:r>
-      <w:proofErr w:type="spellEnd"/>
-      <w:r>
-        <w:rPr>
-          <w:color w:val="000000" w:themeColor="text1"/>
-        </w:rPr>
-        <w:t xml:space="preserve"> our data is always up to date </w:t>
+        <w:t>Fetch latest crypto data (CoinGecko)</w:t>
+      </w:r>
+      <w:r>
+        <w:rPr>
+          <w:color w:val="000000" w:themeColor="text1"/>
+        </w:rPr>
+        <w:t xml:space="preserve"> we use crypto api our data is always up to date </w:t>
       </w:r>
     </w:p>
     <w:p>
@@ -3946,44 +2951,8 @@
         <w:rPr>
           <w:color w:val="000000" w:themeColor="text1"/>
         </w:rPr>
-        <w:t xml:space="preserve"> </w:t>
-      </w:r>
-      <w:proofErr w:type="gramStart"/>
-      <w:r>
-        <w:rPr>
-          <w:color w:val="000000" w:themeColor="text1"/>
-        </w:rPr>
-        <w:t>( get</w:t>
-      </w:r>
-      <w:proofErr w:type="gramEnd"/>
-      <w:r>
-        <w:rPr>
-          <w:color w:val="000000" w:themeColor="text1"/>
-        </w:rPr>
-        <w:t xml:space="preserve"> the output if price </w:t>
-      </w:r>
-      <w:proofErr w:type="gramStart"/>
-      <w:r>
-        <w:rPr>
-          <w:color w:val="000000" w:themeColor="text1"/>
-        </w:rPr>
-        <w:t>trend  will</w:t>
-      </w:r>
-      <w:proofErr w:type="gramEnd"/>
-      <w:r>
-        <w:rPr>
-          <w:color w:val="000000" w:themeColor="text1"/>
-        </w:rPr>
-        <w:t xml:space="preserve"> go up or </w:t>
-      </w:r>
-      <w:proofErr w:type="gramStart"/>
-      <w:r>
-        <w:rPr>
-          <w:color w:val="000000" w:themeColor="text1"/>
-        </w:rPr>
-        <w:t>down )</w:t>
-      </w:r>
-      <w:proofErr w:type="gramEnd"/>
+        <w:t xml:space="preserve"> ( get the output if price trend  will go up or down )</w:t>
+      </w:r>
     </w:p>
     <w:p>
       <w:pPr>
@@ -4008,49 +2977,13 @@
         <w:rPr>
           <w:color w:val="000000" w:themeColor="text1"/>
         </w:rPr>
-        <w:t xml:space="preserve">Fetch recent news via </w:t>
-      </w:r>
-      <w:proofErr w:type="spellStart"/>
-      <w:r>
-        <w:rPr>
-          <w:color w:val="000000" w:themeColor="text1"/>
-        </w:rPr>
-        <w:t>Tavily</w:t>
-      </w:r>
-      <w:proofErr w:type="spellEnd"/>
-      <w:r>
-        <w:rPr>
-          <w:color w:val="000000" w:themeColor="text1"/>
-        </w:rPr>
-        <w:t xml:space="preserve"> </w:t>
-      </w:r>
-      <w:proofErr w:type="gramStart"/>
-      <w:r>
-        <w:rPr>
-          <w:color w:val="000000" w:themeColor="text1"/>
-        </w:rPr>
-        <w:t>( collect</w:t>
-      </w:r>
-      <w:proofErr w:type="gramEnd"/>
-      <w:r>
-        <w:rPr>
-          <w:color w:val="000000" w:themeColor="text1"/>
-        </w:rPr>
-        <w:t xml:space="preserve"> political and economic last </w:t>
-      </w:r>
-      <w:proofErr w:type="gramStart"/>
-      <w:r>
-        <w:rPr>
-          <w:color w:val="000000" w:themeColor="text1"/>
-        </w:rPr>
-        <w:t>news )</w:t>
-      </w:r>
-      <w:proofErr w:type="gramEnd"/>
-      <w:r>
-        <w:rPr>
-          <w:color w:val="000000" w:themeColor="text1"/>
-        </w:rPr>
-        <w:t xml:space="preserve"> </w:t>
+        <w:t>Fetch recent news via Tavily</w:t>
+      </w:r>
+      <w:r>
+        <w:rPr>
+          <w:color w:val="000000" w:themeColor="text1"/>
+        </w:rPr>
+        <w:t xml:space="preserve"> ( collect political and economic last news ) </w:t>
       </w:r>
     </w:p>
     <w:p>
@@ -4108,97 +3041,33 @@
         <w:rPr>
           <w:color w:val="000000" w:themeColor="text1"/>
         </w:rPr>
-        <w:t xml:space="preserve"> </w:t>
-      </w:r>
-      <w:proofErr w:type="gramStart"/>
-      <w:r>
-        <w:rPr>
-          <w:color w:val="000000" w:themeColor="text1"/>
-        </w:rPr>
-        <w:t>( using</w:t>
-      </w:r>
-      <w:proofErr w:type="gramEnd"/>
-      <w:r>
-        <w:rPr>
-          <w:color w:val="000000" w:themeColor="text1"/>
-        </w:rPr>
-        <w:t xml:space="preserve"> web and LSTM </w:t>
-      </w:r>
-      <w:proofErr w:type="gramStart"/>
-      <w:r>
-        <w:rPr>
-          <w:color w:val="000000" w:themeColor="text1"/>
-        </w:rPr>
-        <w:t>output )</w:t>
-      </w:r>
-      <w:proofErr w:type="gramEnd"/>
-      <w:r>
-        <w:rPr>
-          <w:color w:val="000000" w:themeColor="text1"/>
-        </w:rPr>
-        <w:t xml:space="preserve"> </w:t>
-      </w:r>
-    </w:p>
-    <w:p>
-      <w:pPr>
-        <w:rPr>
-          <w:color w:val="000000" w:themeColor="text1"/>
-        </w:rPr>
-      </w:pPr>
-    </w:p>
-    <w:p>
-      <w:pPr>
-        <w:rPr>
-          <w:color w:val="000000" w:themeColor="text1"/>
-        </w:rPr>
-      </w:pPr>
-      <w:r>
-        <w:rPr>
-          <w:color w:val="000000" w:themeColor="text1"/>
-        </w:rPr>
-        <w:t xml:space="preserve">LLM </w:t>
-      </w:r>
-      <w:proofErr w:type="gramStart"/>
-      <w:r>
-        <w:rPr>
-          <w:color w:val="000000" w:themeColor="text1"/>
-        </w:rPr>
-        <w:t>choice :</w:t>
-      </w:r>
-      <w:proofErr w:type="gramEnd"/>
-      <w:r>
-        <w:rPr>
-          <w:color w:val="000000" w:themeColor="text1"/>
-        </w:rPr>
-        <w:t xml:space="preserve"> </w:t>
-      </w:r>
-      <w:proofErr w:type="spellStart"/>
-      <w:r>
-        <w:rPr>
-          <w:color w:val="000000" w:themeColor="text1"/>
-        </w:rPr>
-        <w:t>i</w:t>
-      </w:r>
-      <w:proofErr w:type="spellEnd"/>
-      <w:r>
-        <w:rPr>
-          <w:color w:val="000000" w:themeColor="text1"/>
-        </w:rPr>
-        <w:t xml:space="preserve"> can search for </w:t>
-      </w:r>
-      <w:proofErr w:type="spellStart"/>
-      <w:r>
-        <w:rPr>
-          <w:color w:val="000000" w:themeColor="text1"/>
-        </w:rPr>
-        <w:t>openAI</w:t>
-      </w:r>
-      <w:proofErr w:type="spellEnd"/>
-      <w:r>
-        <w:rPr>
-          <w:color w:val="000000" w:themeColor="text1"/>
-        </w:rPr>
-        <w:t xml:space="preserve"> LLM or </w:t>
+        <w:t xml:space="preserve"> ( using web and LSTM output ) </w:t>
+      </w:r>
+    </w:p>
+    <w:p>
+      <w:pPr>
+        <w:rPr>
+          <w:color w:val="000000" w:themeColor="text1"/>
+        </w:rPr>
+      </w:pPr>
+    </w:p>
+    <w:p>
+      <w:pPr>
+        <w:rPr>
+          <w:color w:val="000000" w:themeColor="text1"/>
+        </w:rPr>
+      </w:pPr>
+      <w:r>
+        <w:rPr>
+          <w:color w:val="000000" w:themeColor="text1"/>
+        </w:rPr>
+        <w:t xml:space="preserve">LLM choice : </w:t>
+      </w:r>
+      <w:r>
+        <w:rPr>
+          <w:color w:val="000000" w:themeColor="text1"/>
+        </w:rPr>
+        <w:t xml:space="preserve">i can search for openAI LLM or </w:t>
       </w:r>
       <w:r>
         <w:rPr>
@@ -4251,21 +3120,7 @@
         <w:rPr>
           <w:color w:val="000000" w:themeColor="text1"/>
         </w:rPr>
-        <w:t xml:space="preserve">Tool options: </w:t>
-      </w:r>
-      <w:proofErr w:type="spellStart"/>
-      <w:r>
-        <w:rPr>
-          <w:color w:val="000000" w:themeColor="text1"/>
-        </w:rPr>
-        <w:t>Streamlit</w:t>
-      </w:r>
-      <w:proofErr w:type="spellEnd"/>
-      <w:r>
-        <w:rPr>
-          <w:color w:val="000000" w:themeColor="text1"/>
-        </w:rPr>
-        <w:t xml:space="preserve"> </w:t>
+        <w:t xml:space="preserve">Tool options: Streamlit </w:t>
       </w:r>
     </w:p>
     <w:p>
@@ -4319,49 +3174,7 @@
         <w:rPr>
           <w:color w:val="000000" w:themeColor="text1"/>
         </w:rPr>
-        <w:t xml:space="preserve"> + technical up to date information </w:t>
-      </w:r>
-      <w:proofErr w:type="gramStart"/>
-      <w:r>
-        <w:rPr>
-          <w:color w:val="000000" w:themeColor="text1"/>
-        </w:rPr>
-        <w:t>( dominance</w:t>
-      </w:r>
-      <w:proofErr w:type="gramEnd"/>
-      <w:r>
-        <w:rPr>
-          <w:color w:val="000000" w:themeColor="text1"/>
-        </w:rPr>
-        <w:t xml:space="preserve"> , market </w:t>
-      </w:r>
-      <w:proofErr w:type="gramStart"/>
-      <w:r>
-        <w:rPr>
-          <w:color w:val="000000" w:themeColor="text1"/>
-        </w:rPr>
-        <w:t>cap ,</w:t>
-      </w:r>
-      <w:proofErr w:type="gramEnd"/>
-      <w:r>
-        <w:rPr>
-          <w:color w:val="000000" w:themeColor="text1"/>
-        </w:rPr>
-        <w:t xml:space="preserve"> current </w:t>
-      </w:r>
-      <w:proofErr w:type="gramStart"/>
-      <w:r>
-        <w:rPr>
-          <w:color w:val="000000" w:themeColor="text1"/>
-        </w:rPr>
-        <w:t>price ,</w:t>
-      </w:r>
-      <w:proofErr w:type="gramEnd"/>
-      <w:r>
-        <w:rPr>
-          <w:color w:val="000000" w:themeColor="text1"/>
-        </w:rPr>
-        <w:t xml:space="preserve"> ....) </w:t>
+        <w:t xml:space="preserve"> + technical up to date information ( dominance , market cap , current price , ....) </w:t>
       </w:r>
     </w:p>
     <w:p>
@@ -4391,19 +3204,11 @@
           <w:color w:val="000000" w:themeColor="text1"/>
         </w:rPr>
       </w:pPr>
-      <w:proofErr w:type="gramStart"/>
-      <w:r>
-        <w:rPr>
-          <w:color w:val="000000" w:themeColor="text1"/>
-        </w:rPr>
-        <w:t>Chatbot :</w:t>
-      </w:r>
-      <w:proofErr w:type="gramEnd"/>
-      <w:r>
-        <w:rPr>
-          <w:color w:val="000000" w:themeColor="text1"/>
-        </w:rPr>
-        <w:t xml:space="preserve"> </w:t>
+      <w:r>
+        <w:rPr>
+          <w:color w:val="000000" w:themeColor="text1"/>
+        </w:rPr>
+        <w:t xml:space="preserve">Chatbot : </w:t>
       </w:r>
       <w:r>
         <w:rPr>
@@ -4436,29 +3241,173 @@
           <w:color w:val="C00000"/>
         </w:rPr>
       </w:pPr>
-    </w:p>
-    <w:p>
-      <w:pPr>
-        <w:rPr>
-          <w:b/>
-          <w:bCs/>
-          <w:color w:val="000000" w:themeColor="text1"/>
-        </w:rPr>
-      </w:pPr>
-    </w:p>
-    <w:p>
-      <w:pPr>
-        <w:rPr>
-          <w:color w:val="000000" w:themeColor="text1"/>
-        </w:rPr>
-      </w:pPr>
-    </w:p>
-    <w:p>
-      <w:pPr>
-        <w:rPr>
-          <w:color w:val="000000" w:themeColor="text1"/>
-        </w:rPr>
-      </w:pPr>
+      <w:r>
+        <w:rPr>
+          <w:b/>
+          <w:bCs/>
+          <w:color w:val="C00000"/>
+        </w:rPr>
+        <w:t xml:space="preserve">Pipelines </w:t>
+      </w:r>
+    </w:p>
+    <w:p>
+      <w:pPr>
+        <w:rPr>
+          <w:b/>
+          <w:bCs/>
+          <w:color w:val="C00000"/>
+        </w:rPr>
+      </w:pPr>
+      <w:r>
+        <w:rPr>
+          <w:b/>
+          <w:bCs/>
+          <w:noProof/>
+          <w:color w:val="C00000"/>
+        </w:rPr>
+        <w:drawing>
+          <wp:inline distT="0" distB="0" distL="0" distR="0" wp14:anchorId="180303D8" wp14:editId="5B3CB161">
+            <wp:extent cx="5731510" cy="2884805"/>
+            <wp:effectExtent l="0" t="0" r="2540" b="0"/>
+            <wp:docPr id="481438889" name="Picture 1"/>
+            <wp:cNvGraphicFramePr>
+              <a:graphicFrameLocks xmlns:a="http://schemas.openxmlformats.org/drawingml/2006/main" noChangeAspect="1"/>
+            </wp:cNvGraphicFramePr>
+            <a:graphic xmlns:a="http://schemas.openxmlformats.org/drawingml/2006/main">
+              <a:graphicData uri="http://schemas.openxmlformats.org/drawingml/2006/picture">
+                <pic:pic xmlns:pic="http://schemas.openxmlformats.org/drawingml/2006/picture">
+                  <pic:nvPicPr>
+                    <pic:cNvPr id="481438889" name=""/>
+                    <pic:cNvPicPr/>
+                  </pic:nvPicPr>
+                  <pic:blipFill>
+                    <a:blip r:embed="rId5"/>
+                    <a:stretch>
+                      <a:fillRect/>
+                    </a:stretch>
+                  </pic:blipFill>
+                  <pic:spPr>
+                    <a:xfrm>
+                      <a:off x="0" y="0"/>
+                      <a:ext cx="5731510" cy="2884805"/>
+                    </a:xfrm>
+                    <a:prstGeom prst="rect">
+                      <a:avLst/>
+                    </a:prstGeom>
+                  </pic:spPr>
+                </pic:pic>
+              </a:graphicData>
+            </a:graphic>
+          </wp:inline>
+        </w:drawing>
+      </w:r>
+    </w:p>
+    <w:p>
+      <w:pPr>
+        <w:rPr>
+          <w:b/>
+          <w:bCs/>
+          <w:color w:val="000000" w:themeColor="text1"/>
+        </w:rPr>
+      </w:pPr>
+      <w:r>
+        <w:rPr>
+          <w:b/>
+          <w:bCs/>
+          <w:noProof/>
+          <w:color w:val="000000" w:themeColor="text1"/>
+        </w:rPr>
+        <w:drawing>
+          <wp:inline distT="0" distB="0" distL="0" distR="0" wp14:anchorId="69083201" wp14:editId="09A95E57">
+            <wp:extent cx="5731510" cy="2437765"/>
+            <wp:effectExtent l="0" t="0" r="2540" b="635"/>
+            <wp:docPr id="518315222" name="Picture 1"/>
+            <wp:cNvGraphicFramePr>
+              <a:graphicFrameLocks xmlns:a="http://schemas.openxmlformats.org/drawingml/2006/main" noChangeAspect="1"/>
+            </wp:cNvGraphicFramePr>
+            <a:graphic xmlns:a="http://schemas.openxmlformats.org/drawingml/2006/main">
+              <a:graphicData uri="http://schemas.openxmlformats.org/drawingml/2006/picture">
+                <pic:pic xmlns:pic="http://schemas.openxmlformats.org/drawingml/2006/picture">
+                  <pic:nvPicPr>
+                    <pic:cNvPr id="518315222" name=""/>
+                    <pic:cNvPicPr/>
+                  </pic:nvPicPr>
+                  <pic:blipFill>
+                    <a:blip r:embed="rId6"/>
+                    <a:stretch>
+                      <a:fillRect/>
+                    </a:stretch>
+                  </pic:blipFill>
+                  <pic:spPr>
+                    <a:xfrm>
+                      <a:off x="0" y="0"/>
+                      <a:ext cx="5731510" cy="2437765"/>
+                    </a:xfrm>
+                    <a:prstGeom prst="rect">
+                      <a:avLst/>
+                    </a:prstGeom>
+                  </pic:spPr>
+                </pic:pic>
+              </a:graphicData>
+            </a:graphic>
+          </wp:inline>
+        </w:drawing>
+      </w:r>
+    </w:p>
+    <w:p>
+      <w:pPr>
+        <w:rPr>
+          <w:color w:val="000000" w:themeColor="text1"/>
+        </w:rPr>
+      </w:pPr>
+    </w:p>
+    <w:p>
+      <w:pPr>
+        <w:rPr>
+          <w:color w:val="000000" w:themeColor="text1"/>
+        </w:rPr>
+      </w:pPr>
+      <w:r>
+        <w:rPr>
+          <w:color w:val="000000" w:themeColor="text1"/>
+        </w:rPr>
+        <w:lastRenderedPageBreak/>
+        <w:drawing>
+          <wp:inline distT="0" distB="0" distL="0" distR="0" wp14:anchorId="6E76ADA3" wp14:editId="59F038B4">
+            <wp:extent cx="4502381" cy="1587582"/>
+            <wp:effectExtent l="0" t="0" r="0" b="0"/>
+            <wp:docPr id="551835583" name="Picture 1"/>
+            <wp:cNvGraphicFramePr>
+              <a:graphicFrameLocks xmlns:a="http://schemas.openxmlformats.org/drawingml/2006/main" noChangeAspect="1"/>
+            </wp:cNvGraphicFramePr>
+            <a:graphic xmlns:a="http://schemas.openxmlformats.org/drawingml/2006/main">
+              <a:graphicData uri="http://schemas.openxmlformats.org/drawingml/2006/picture">
+                <pic:pic xmlns:pic="http://schemas.openxmlformats.org/drawingml/2006/picture">
+                  <pic:nvPicPr>
+                    <pic:cNvPr id="551835583" name=""/>
+                    <pic:cNvPicPr/>
+                  </pic:nvPicPr>
+                  <pic:blipFill>
+                    <a:blip r:embed="rId7"/>
+                    <a:stretch>
+                      <a:fillRect/>
+                    </a:stretch>
+                  </pic:blipFill>
+                  <pic:spPr>
+                    <a:xfrm>
+                      <a:off x="0" y="0"/>
+                      <a:ext cx="4502381" cy="1587582"/>
+                    </a:xfrm>
+                    <a:prstGeom prst="rect">
+                      <a:avLst/>
+                    </a:prstGeom>
+                  </pic:spPr>
+                </pic:pic>
+              </a:graphicData>
+            </a:graphic>
+          </wp:inline>
+        </w:drawing>
+      </w:r>
     </w:p>
     <w:p>
       <w:pPr>

</xml_diff>

<commit_message>
updated RAG and Tavily
</commit_message>
<xml_diff>
--- a/Final_project_roadmap_V0.docx
+++ b/Final_project_roadmap_V0.docx
@@ -146,18 +146,60 @@
         <w:rPr>
           <w:color w:val="3A3A3A" w:themeColor="background2" w:themeShade="40"/>
         </w:rPr>
-        <w:t>(dominance</w:t>
-      </w:r>
+        <w:t>(</w:t>
+      </w:r>
+      <w:proofErr w:type="gramStart"/>
       <w:r>
         <w:rPr>
           <w:color w:val="3A3A3A" w:themeColor="background2" w:themeShade="40"/>
         </w:rPr>
-        <w:t xml:space="preserve"> , market cap , altcoin season rate ... ) </w:t>
+        <w:t>dominance</w:t>
       </w:r>
       <w:r>
         <w:rPr>
           <w:color w:val="3A3A3A" w:themeColor="background2" w:themeShade="40"/>
         </w:rPr>
+        <w:t xml:space="preserve"> ,</w:t>
+      </w:r>
+      <w:proofErr w:type="gramEnd"/>
+      <w:r>
+        <w:rPr>
+          <w:color w:val="3A3A3A" w:themeColor="background2" w:themeShade="40"/>
+        </w:rPr>
+        <w:t xml:space="preserve"> market </w:t>
+      </w:r>
+      <w:proofErr w:type="gramStart"/>
+      <w:r>
+        <w:rPr>
+          <w:color w:val="3A3A3A" w:themeColor="background2" w:themeShade="40"/>
+        </w:rPr>
+        <w:t>cap ,</w:t>
+      </w:r>
+      <w:proofErr w:type="gramEnd"/>
+      <w:r>
+        <w:rPr>
+          <w:color w:val="3A3A3A" w:themeColor="background2" w:themeShade="40"/>
+        </w:rPr>
+        <w:t xml:space="preserve"> altcoin season rate </w:t>
+      </w:r>
+      <w:proofErr w:type="gramStart"/>
+      <w:r>
+        <w:rPr>
+          <w:color w:val="3A3A3A" w:themeColor="background2" w:themeShade="40"/>
+        </w:rPr>
+        <w:t>... )</w:t>
+      </w:r>
+      <w:proofErr w:type="gramEnd"/>
+      <w:r>
+        <w:rPr>
+          <w:color w:val="3A3A3A" w:themeColor="background2" w:themeShade="40"/>
+        </w:rPr>
+        <w:t xml:space="preserve"> </w:t>
+      </w:r>
+      <w:r>
+        <w:rPr>
+          <w:color w:val="3A3A3A" w:themeColor="background2" w:themeShade="40"/>
+        </w:rPr>
         <w:t>and</w:t>
       </w:r>
       <w:r>
@@ -184,11 +226,33 @@
         </w:rPr>
         <w:t xml:space="preserve"> to predict the future price trend </w:t>
       </w:r>
+      <w:proofErr w:type="gramStart"/>
       <w:r>
         <w:rPr>
           <w:color w:val="3A3A3A" w:themeColor="background2" w:themeShade="40"/>
         </w:rPr>
-        <w:t xml:space="preserve">( usually not found in the web ) </w:t>
+        <w:t>( usually</w:t>
+      </w:r>
+      <w:proofErr w:type="gramEnd"/>
+      <w:r>
+        <w:rPr>
+          <w:color w:val="3A3A3A" w:themeColor="background2" w:themeShade="40"/>
+        </w:rPr>
+        <w:t xml:space="preserve"> not found in the </w:t>
+      </w:r>
+      <w:proofErr w:type="gramStart"/>
+      <w:r>
+        <w:rPr>
+          <w:color w:val="3A3A3A" w:themeColor="background2" w:themeShade="40"/>
+        </w:rPr>
+        <w:t>web )</w:t>
+      </w:r>
+      <w:proofErr w:type="gramEnd"/>
+      <w:r>
+        <w:rPr>
+          <w:color w:val="3A3A3A" w:themeColor="background2" w:themeShade="40"/>
+        </w:rPr>
+        <w:t xml:space="preserve"> </w:t>
       </w:r>
     </w:p>
     <w:p>
@@ -206,13 +270,83 @@
         <w:rPr>
           <w:color w:val="3A3A3A" w:themeColor="background2" w:themeShade="40"/>
         </w:rPr>
-        <w:t xml:space="preserve">Retrieves the latest macro economic information from the web ( rate cuts , wars , </w:t>
-      </w:r>
+        <w:t xml:space="preserve">Retrieves the latest macro economic information from the web </w:t>
+      </w:r>
+      <w:proofErr w:type="gramStart"/>
       <w:r>
         <w:rPr>
           <w:color w:val="3A3A3A" w:themeColor="background2" w:themeShade="40"/>
         </w:rPr>
-        <w:t xml:space="preserve">ETF approval , ... ) </w:t>
+        <w:t>( rate</w:t>
+      </w:r>
+      <w:proofErr w:type="gramEnd"/>
+      <w:r>
+        <w:rPr>
+          <w:color w:val="3A3A3A" w:themeColor="background2" w:themeShade="40"/>
+        </w:rPr>
+        <w:t xml:space="preserve"> </w:t>
+      </w:r>
+      <w:proofErr w:type="gramStart"/>
+      <w:r>
+        <w:rPr>
+          <w:color w:val="3A3A3A" w:themeColor="background2" w:themeShade="40"/>
+        </w:rPr>
+        <w:t>cuts ,</w:t>
+      </w:r>
+      <w:proofErr w:type="gramEnd"/>
+      <w:r>
+        <w:rPr>
+          <w:color w:val="3A3A3A" w:themeColor="background2" w:themeShade="40"/>
+        </w:rPr>
+        <w:t xml:space="preserve"> </w:t>
+      </w:r>
+      <w:proofErr w:type="gramStart"/>
+      <w:r>
+        <w:rPr>
+          <w:color w:val="3A3A3A" w:themeColor="background2" w:themeShade="40"/>
+        </w:rPr>
+        <w:t>wars ,</w:t>
+      </w:r>
+      <w:proofErr w:type="gramEnd"/>
+      <w:r>
+        <w:rPr>
+          <w:color w:val="3A3A3A" w:themeColor="background2" w:themeShade="40"/>
+        </w:rPr>
+        <w:t xml:space="preserve"> </w:t>
+      </w:r>
+      <w:r>
+        <w:rPr>
+          <w:color w:val="3A3A3A" w:themeColor="background2" w:themeShade="40"/>
+        </w:rPr>
+        <w:t xml:space="preserve">ETF </w:t>
+      </w:r>
+      <w:proofErr w:type="gramStart"/>
+      <w:r>
+        <w:rPr>
+          <w:color w:val="3A3A3A" w:themeColor="background2" w:themeShade="40"/>
+        </w:rPr>
+        <w:t>approval ,</w:t>
+      </w:r>
+      <w:proofErr w:type="gramEnd"/>
+      <w:r>
+        <w:rPr>
+          <w:color w:val="3A3A3A" w:themeColor="background2" w:themeShade="40"/>
+        </w:rPr>
+        <w:t xml:space="preserve"> </w:t>
+      </w:r>
+      <w:proofErr w:type="gramStart"/>
+      <w:r>
+        <w:rPr>
+          <w:color w:val="3A3A3A" w:themeColor="background2" w:themeShade="40"/>
+        </w:rPr>
+        <w:t>... )</w:t>
+      </w:r>
+      <w:proofErr w:type="gramEnd"/>
+      <w:r>
+        <w:rPr>
+          <w:color w:val="3A3A3A" w:themeColor="background2" w:themeShade="40"/>
+        </w:rPr>
+        <w:t xml:space="preserve"> </w:t>
       </w:r>
     </w:p>
     <w:p>
@@ -278,7 +412,21 @@
         <w:rPr>
           <w:color w:val="3A3A3A" w:themeColor="background2" w:themeShade="40"/>
         </w:rPr>
-        <w:t xml:space="preserve">and answer users questions through a chatbot </w:t>
+        <w:t xml:space="preserve">and answer </w:t>
+      </w:r>
+      <w:proofErr w:type="gramStart"/>
+      <w:r>
+        <w:rPr>
+          <w:color w:val="3A3A3A" w:themeColor="background2" w:themeShade="40"/>
+        </w:rPr>
+        <w:t>users</w:t>
+      </w:r>
+      <w:proofErr w:type="gramEnd"/>
+      <w:r>
+        <w:rPr>
+          <w:color w:val="3A3A3A" w:themeColor="background2" w:themeShade="40"/>
+        </w:rPr>
+        <w:t xml:space="preserve"> questions through a chatbot </w:t>
       </w:r>
     </w:p>
     <w:p>
@@ -613,13 +761,27 @@
         <w:rPr>
           <w:color w:val="000000" w:themeColor="text1"/>
         </w:rPr>
-        <w:t xml:space="preserve"> the models</w:t>
-      </w:r>
-      <w:r>
-        <w:rPr>
-          <w:color w:val="000000" w:themeColor="text1"/>
-        </w:rPr>
-        <w:t xml:space="preserve"> , and remain relevant as market conditions </w:t>
+        <w:t xml:space="preserve"> the </w:t>
+      </w:r>
+      <w:proofErr w:type="gramStart"/>
+      <w:r>
+        <w:rPr>
+          <w:color w:val="000000" w:themeColor="text1"/>
+        </w:rPr>
+        <w:t>models</w:t>
+      </w:r>
+      <w:r>
+        <w:rPr>
+          <w:color w:val="000000" w:themeColor="text1"/>
+        </w:rPr>
+        <w:t xml:space="preserve"> ,</w:t>
+      </w:r>
+      <w:proofErr w:type="gramEnd"/>
+      <w:r>
+        <w:rPr>
+          <w:color w:val="000000" w:themeColor="text1"/>
+        </w:rPr>
+        <w:t xml:space="preserve"> and remain relevant as market conditions </w:t>
       </w:r>
       <w:r>
         <w:rPr>
@@ -659,6 +821,7 @@
           <w:color w:val="000000" w:themeColor="text1"/>
         </w:rPr>
       </w:pPr>
+      <w:proofErr w:type="gramStart"/>
       <w:r>
         <w:rPr>
           <w:b/>
@@ -673,7 +836,16 @@
           <w:bCs/>
           <w:color w:val="000000" w:themeColor="text1"/>
         </w:rPr>
-        <w:t xml:space="preserve">: </w:t>
+        <w:t>:</w:t>
+      </w:r>
+      <w:proofErr w:type="gramEnd"/>
+      <w:r>
+        <w:rPr>
+          <w:b/>
+          <w:bCs/>
+          <w:color w:val="000000" w:themeColor="text1"/>
+        </w:rPr>
+        <w:t xml:space="preserve"> </w:t>
       </w:r>
       <w:r>
         <w:rPr>
@@ -782,6 +954,7 @@
         </w:rPr>
         <w:t xml:space="preserve"> will use </w:t>
       </w:r>
+      <w:proofErr w:type="spellStart"/>
       <w:r>
         <w:rPr>
           <w:color w:val="000000" w:themeColor="text1"/>
@@ -792,43 +965,68 @@
         <w:rPr>
           <w:color w:val="000000" w:themeColor="text1"/>
         </w:rPr>
-        <w:t xml:space="preserve">data </w:t>
-      </w:r>
-    </w:p>
-    <w:p>
-      <w:pPr>
-        <w:rPr>
-          <w:b/>
-          <w:bCs/>
-          <w:color w:val="000000" w:themeColor="text1"/>
-        </w:rPr>
-      </w:pPr>
-    </w:p>
-    <w:p>
-      <w:pPr>
-        <w:rPr>
-          <w:color w:val="000000" w:themeColor="text1"/>
-        </w:rPr>
-      </w:pPr>
-      <w:r>
-        <w:rPr>
-          <w:b/>
-          <w:bCs/>
-          <w:color w:val="000000" w:themeColor="text1"/>
-        </w:rPr>
-        <w:t>Dataset source :</w:t>
-      </w:r>
+        <w:t>data</w:t>
+      </w:r>
+      <w:proofErr w:type="spellEnd"/>
       <w:r>
         <w:rPr>
           <w:color w:val="000000" w:themeColor="text1"/>
         </w:rPr>
         <w:t xml:space="preserve"> </w:t>
       </w:r>
-      <w:r>
-        <w:rPr>
-          <w:color w:val="000000" w:themeColor="text1"/>
-        </w:rPr>
-        <w:t>CoinGecko API</w:t>
+    </w:p>
+    <w:p>
+      <w:pPr>
+        <w:rPr>
+          <w:b/>
+          <w:bCs/>
+          <w:color w:val="000000" w:themeColor="text1"/>
+        </w:rPr>
+      </w:pPr>
+    </w:p>
+    <w:p>
+      <w:pPr>
+        <w:rPr>
+          <w:color w:val="000000" w:themeColor="text1"/>
+        </w:rPr>
+      </w:pPr>
+      <w:r>
+        <w:rPr>
+          <w:b/>
+          <w:bCs/>
+          <w:color w:val="000000" w:themeColor="text1"/>
+        </w:rPr>
+        <w:t xml:space="preserve">Dataset </w:t>
+      </w:r>
+      <w:proofErr w:type="gramStart"/>
+      <w:r>
+        <w:rPr>
+          <w:b/>
+          <w:bCs/>
+          <w:color w:val="000000" w:themeColor="text1"/>
+        </w:rPr>
+        <w:t>source :</w:t>
+      </w:r>
+      <w:proofErr w:type="gramEnd"/>
+      <w:r>
+        <w:rPr>
+          <w:color w:val="000000" w:themeColor="text1"/>
+        </w:rPr>
+        <w:t xml:space="preserve"> </w:t>
+      </w:r>
+      <w:proofErr w:type="spellStart"/>
+      <w:r>
+        <w:rPr>
+          <w:color w:val="000000" w:themeColor="text1"/>
+        </w:rPr>
+        <w:t>CoinGecko</w:t>
+      </w:r>
+      <w:proofErr w:type="spellEnd"/>
+      <w:r>
+        <w:rPr>
+          <w:color w:val="000000" w:themeColor="text1"/>
+        </w:rPr>
+        <w:t xml:space="preserve"> API</w:t>
       </w:r>
       <w:r>
         <w:rPr>
@@ -886,7 +1084,15 @@
         <w:rPr>
           <w:color w:val="000000" w:themeColor="text1"/>
         </w:rPr>
-        <w:t>urrent price</w:t>
+        <w:t xml:space="preserve">urrent </w:t>
+      </w:r>
+      <w:proofErr w:type="spellStart"/>
+      <w:proofErr w:type="gramStart"/>
+      <w:r>
+        <w:rPr>
+          <w:color w:val="000000" w:themeColor="text1"/>
+        </w:rPr>
+        <w:t>price</w:t>
       </w:r>
       <w:r>
         <w:rPr>
@@ -898,7 +1104,22 @@
         <w:rPr>
           <w:color w:val="000000" w:themeColor="text1"/>
         </w:rPr>
-        <w:t>Historical prices (daily, hourly)</w:t>
+        <w:t>Historical</w:t>
+      </w:r>
+      <w:proofErr w:type="spellEnd"/>
+      <w:proofErr w:type="gramEnd"/>
+      <w:r>
+        <w:rPr>
+          <w:color w:val="000000" w:themeColor="text1"/>
+        </w:rPr>
+        <w:t xml:space="preserve"> prices (daily, hourly</w:t>
+      </w:r>
+      <w:proofErr w:type="gramStart"/>
+      <w:r>
+        <w:rPr>
+          <w:color w:val="000000" w:themeColor="text1"/>
+        </w:rPr>
+        <w:t>)</w:t>
       </w:r>
       <w:r>
         <w:rPr>
@@ -910,7 +1131,14 @@
         <w:rPr>
           <w:color w:val="000000" w:themeColor="text1"/>
         </w:rPr>
-        <w:t>Market cap, volume</w:t>
+        <w:t>Market</w:t>
+      </w:r>
+      <w:proofErr w:type="gramEnd"/>
+      <w:r>
+        <w:rPr>
+          <w:color w:val="000000" w:themeColor="text1"/>
+        </w:rPr>
+        <w:t xml:space="preserve"> cap, volume</w:t>
       </w:r>
       <w:r>
         <w:rPr>
@@ -967,7 +1195,14 @@
         <w:rPr>
           <w:color w:val="000000" w:themeColor="text1"/>
         </w:rPr>
-        <w:t xml:space="preserve"> format: JSON → easy to convert to Pandas d</w:t>
+        <w:t xml:space="preserve"> format: JSON → easy to convert to Pandas </w:t>
+      </w:r>
+      <w:proofErr w:type="spellStart"/>
+      <w:r>
+        <w:rPr>
+          <w:color w:val="000000" w:themeColor="text1"/>
+        </w:rPr>
+        <w:t>d</w:t>
       </w:r>
       <w:r>
         <w:rPr>
@@ -975,6 +1210,7 @@
         </w:rPr>
         <w:t>f</w:t>
       </w:r>
+      <w:proofErr w:type="spellEnd"/>
       <w:r>
         <w:rPr>
           <w:color w:val="000000" w:themeColor="text1"/>
@@ -1048,7 +1284,21 @@
         <w:rPr>
           <w:color w:val="000000" w:themeColor="text1"/>
         </w:rPr>
-        <w:t xml:space="preserve">Altcoins index  or </w:t>
+        <w:t xml:space="preserve">Altcoins </w:t>
+      </w:r>
+      <w:proofErr w:type="gramStart"/>
+      <w:r>
+        <w:rPr>
+          <w:color w:val="000000" w:themeColor="text1"/>
+        </w:rPr>
+        <w:t>index  or</w:t>
+      </w:r>
+      <w:proofErr w:type="gramEnd"/>
+      <w:r>
+        <w:rPr>
+          <w:color w:val="000000" w:themeColor="text1"/>
+        </w:rPr>
+        <w:t xml:space="preserve"> </w:t>
       </w:r>
       <w:r>
         <w:rPr>
@@ -1115,19 +1365,89 @@
         <w:rPr>
           <w:color w:val="000000" w:themeColor="text1"/>
         </w:rPr>
-        <w:t>Descriptive statistic : mean, median , standard deviation</w:t>
-      </w:r>
-      <w:r>
-        <w:rPr>
-          <w:color w:val="000000" w:themeColor="text1"/>
-        </w:rPr>
-        <w:t xml:space="preserve">, price vs marketcap, whales movements, dominance </w:t>
-      </w:r>
-      <w:r>
-        <w:rPr>
-          <w:color w:val="000000" w:themeColor="text1"/>
-        </w:rPr>
-        <w:t xml:space="preserve"> ... </w:t>
+        <w:t xml:space="preserve">Descriptive </w:t>
+      </w:r>
+      <w:proofErr w:type="gramStart"/>
+      <w:r>
+        <w:rPr>
+          <w:color w:val="000000" w:themeColor="text1"/>
+        </w:rPr>
+        <w:t>statistic :</w:t>
+      </w:r>
+      <w:proofErr w:type="gramEnd"/>
+      <w:r>
+        <w:rPr>
+          <w:color w:val="000000" w:themeColor="text1"/>
+        </w:rPr>
+        <w:t xml:space="preserve"> mean, </w:t>
+      </w:r>
+      <w:proofErr w:type="gramStart"/>
+      <w:r>
+        <w:rPr>
+          <w:color w:val="000000" w:themeColor="text1"/>
+        </w:rPr>
+        <w:t>median ,</w:t>
+      </w:r>
+      <w:proofErr w:type="gramEnd"/>
+      <w:r>
+        <w:rPr>
+          <w:color w:val="000000" w:themeColor="text1"/>
+        </w:rPr>
+        <w:t xml:space="preserve"> standard deviation</w:t>
+      </w:r>
+      <w:r>
+        <w:rPr>
+          <w:color w:val="000000" w:themeColor="text1"/>
+        </w:rPr>
+        <w:t xml:space="preserve">, price vs </w:t>
+      </w:r>
+      <w:proofErr w:type="spellStart"/>
+      <w:r>
+        <w:rPr>
+          <w:color w:val="000000" w:themeColor="text1"/>
+        </w:rPr>
+        <w:t>marketcap</w:t>
+      </w:r>
+      <w:proofErr w:type="spellEnd"/>
+      <w:r>
+        <w:rPr>
+          <w:color w:val="000000" w:themeColor="text1"/>
+        </w:rPr>
+        <w:t xml:space="preserve">, </w:t>
+      </w:r>
+      <w:proofErr w:type="gramStart"/>
+      <w:r>
+        <w:rPr>
+          <w:color w:val="000000" w:themeColor="text1"/>
+        </w:rPr>
+        <w:t>whales</w:t>
+      </w:r>
+      <w:proofErr w:type="gramEnd"/>
+      <w:r>
+        <w:rPr>
+          <w:color w:val="000000" w:themeColor="text1"/>
+        </w:rPr>
+        <w:t xml:space="preserve"> movements, </w:t>
+      </w:r>
+      <w:proofErr w:type="gramStart"/>
+      <w:r>
+        <w:rPr>
+          <w:color w:val="000000" w:themeColor="text1"/>
+        </w:rPr>
+        <w:t xml:space="preserve">dominance </w:t>
+      </w:r>
+      <w:r>
+        <w:rPr>
+          <w:color w:val="000000" w:themeColor="text1"/>
+        </w:rPr>
+        <w:t xml:space="preserve"> ...</w:t>
+      </w:r>
+      <w:proofErr w:type="gramEnd"/>
+      <w:r>
+        <w:rPr>
+          <w:color w:val="000000" w:themeColor="text1"/>
+        </w:rPr>
+        <w:t xml:space="preserve"> </w:t>
       </w:r>
     </w:p>
     <w:p>
@@ -1144,7 +1464,21 @@
         <w:rPr>
           <w:color w:val="000000" w:themeColor="text1"/>
         </w:rPr>
-        <w:t xml:space="preserve">Time series analyse ( important) volatility and trend over time </w:t>
+        <w:t xml:space="preserve">Time series analyse </w:t>
+      </w:r>
+      <w:proofErr w:type="gramStart"/>
+      <w:r>
+        <w:rPr>
+          <w:color w:val="000000" w:themeColor="text1"/>
+        </w:rPr>
+        <w:t>( important</w:t>
+      </w:r>
+      <w:proofErr w:type="gramEnd"/>
+      <w:r>
+        <w:rPr>
+          <w:color w:val="000000" w:themeColor="text1"/>
+        </w:rPr>
+        <w:t xml:space="preserve">) volatility and trend over time </w:t>
       </w:r>
     </w:p>
     <w:p>
@@ -1161,7 +1495,35 @@
         <w:rPr>
           <w:color w:val="000000" w:themeColor="text1"/>
         </w:rPr>
-        <w:t xml:space="preserve">Price correlation ( our target ) </w:t>
+        <w:t xml:space="preserve">Price correlation </w:t>
+      </w:r>
+      <w:proofErr w:type="gramStart"/>
+      <w:r>
+        <w:rPr>
+          <w:color w:val="000000" w:themeColor="text1"/>
+        </w:rPr>
+        <w:t>( our</w:t>
+      </w:r>
+      <w:proofErr w:type="gramEnd"/>
+      <w:r>
+        <w:rPr>
+          <w:color w:val="000000" w:themeColor="text1"/>
+        </w:rPr>
+        <w:t xml:space="preserve"> </w:t>
+      </w:r>
+      <w:proofErr w:type="gramStart"/>
+      <w:r>
+        <w:rPr>
+          <w:color w:val="000000" w:themeColor="text1"/>
+        </w:rPr>
+        <w:t>target )</w:t>
+      </w:r>
+      <w:proofErr w:type="gramEnd"/>
+      <w:r>
+        <w:rPr>
+          <w:color w:val="000000" w:themeColor="text1"/>
+        </w:rPr>
+        <w:t xml:space="preserve"> </w:t>
       </w:r>
     </w:p>
     <w:p>
@@ -1178,30 +1540,108 @@
         <w:rPr>
           <w:color w:val="000000" w:themeColor="text1"/>
         </w:rPr>
-        <w:t xml:space="preserve">Classification by market cap , </w:t>
-      </w:r>
-      <w:r>
-        <w:rPr>
-          <w:color w:val="000000" w:themeColor="text1"/>
-        </w:rPr>
-        <w:t xml:space="preserve">volatility ( high , low ) </w:t>
-      </w:r>
-    </w:p>
-    <w:p>
-      <w:pPr>
-        <w:rPr>
-          <w:b/>
-          <w:bCs/>
-          <w:color w:val="000000" w:themeColor="text1"/>
-        </w:rPr>
-      </w:pPr>
-      <w:r>
-        <w:rPr>
-          <w:b/>
-          <w:bCs/>
-          <w:color w:val="000000" w:themeColor="text1"/>
-        </w:rPr>
-        <w:t xml:space="preserve">At the end of the EDA we should be able to answer : </w:t>
+        <w:t xml:space="preserve">Classification by market </w:t>
+      </w:r>
+      <w:proofErr w:type="gramStart"/>
+      <w:r>
+        <w:rPr>
+          <w:color w:val="000000" w:themeColor="text1"/>
+        </w:rPr>
+        <w:t>cap ,</w:t>
+      </w:r>
+      <w:proofErr w:type="gramEnd"/>
+      <w:r>
+        <w:rPr>
+          <w:color w:val="000000" w:themeColor="text1"/>
+        </w:rPr>
+        <w:t xml:space="preserve"> </w:t>
+      </w:r>
+      <w:r>
+        <w:rPr>
+          <w:color w:val="000000" w:themeColor="text1"/>
+        </w:rPr>
+        <w:t xml:space="preserve">volatility </w:t>
+      </w:r>
+      <w:proofErr w:type="gramStart"/>
+      <w:r>
+        <w:rPr>
+          <w:color w:val="000000" w:themeColor="text1"/>
+        </w:rPr>
+        <w:t>( high</w:t>
+      </w:r>
+      <w:proofErr w:type="gramEnd"/>
+      <w:r>
+        <w:rPr>
+          <w:color w:val="000000" w:themeColor="text1"/>
+        </w:rPr>
+        <w:t xml:space="preserve"> , </w:t>
+      </w:r>
+      <w:proofErr w:type="gramStart"/>
+      <w:r>
+        <w:rPr>
+          <w:color w:val="000000" w:themeColor="text1"/>
+        </w:rPr>
+        <w:t>low )</w:t>
+      </w:r>
+      <w:proofErr w:type="gramEnd"/>
+      <w:r>
+        <w:rPr>
+          <w:color w:val="000000" w:themeColor="text1"/>
+        </w:rPr>
+        <w:t xml:space="preserve"> </w:t>
+      </w:r>
+    </w:p>
+    <w:p>
+      <w:pPr>
+        <w:rPr>
+          <w:b/>
+          <w:bCs/>
+          <w:color w:val="000000" w:themeColor="text1"/>
+        </w:rPr>
+      </w:pPr>
+      <w:r>
+        <w:rPr>
+          <w:b/>
+          <w:bCs/>
+          <w:color w:val="000000" w:themeColor="text1"/>
+        </w:rPr>
+        <w:t xml:space="preserve">At the end of the </w:t>
+      </w:r>
+      <w:proofErr w:type="gramStart"/>
+      <w:r>
+        <w:rPr>
+          <w:b/>
+          <w:bCs/>
+          <w:color w:val="000000" w:themeColor="text1"/>
+        </w:rPr>
+        <w:t>EDA</w:t>
+      </w:r>
+      <w:proofErr w:type="gramEnd"/>
+      <w:r>
+        <w:rPr>
+          <w:b/>
+          <w:bCs/>
+          <w:color w:val="000000" w:themeColor="text1"/>
+        </w:rPr>
+        <w:t xml:space="preserve"> we should be able to </w:t>
+      </w:r>
+      <w:proofErr w:type="gramStart"/>
+      <w:r>
+        <w:rPr>
+          <w:b/>
+          <w:bCs/>
+          <w:color w:val="000000" w:themeColor="text1"/>
+        </w:rPr>
+        <w:t>answer :</w:t>
+      </w:r>
+      <w:proofErr w:type="gramEnd"/>
+      <w:r>
+        <w:rPr>
+          <w:b/>
+          <w:bCs/>
+          <w:color w:val="000000" w:themeColor="text1"/>
+        </w:rPr>
+        <w:t xml:space="preserve"> </w:t>
       </w:r>
     </w:p>
     <w:p>
@@ -1264,7 +1704,29 @@
           <w:sz w:val="32"/>
           <w:szCs w:val="32"/>
         </w:rPr>
-        <w:t xml:space="preserve">Models training challenges and solutions : </w:t>
+        <w:t xml:space="preserve">Models training challenges and </w:t>
+      </w:r>
+      <w:proofErr w:type="gramStart"/>
+      <w:r>
+        <w:rPr>
+          <w:b/>
+          <w:bCs/>
+          <w:color w:val="C00000"/>
+          <w:sz w:val="32"/>
+          <w:szCs w:val="32"/>
+        </w:rPr>
+        <w:t>solutions :</w:t>
+      </w:r>
+      <w:proofErr w:type="gramEnd"/>
+      <w:r>
+        <w:rPr>
+          <w:b/>
+          <w:bCs/>
+          <w:color w:val="C00000"/>
+          <w:sz w:val="32"/>
+          <w:szCs w:val="32"/>
+        </w:rPr>
+        <w:t xml:space="preserve"> </w:t>
       </w:r>
     </w:p>
     <w:p>
@@ -1391,12 +1853,37 @@
         </w:rPr>
         <w:t xml:space="preserve"> </w:t>
       </w:r>
-      <w:r>
-        <w:rPr>
-          <w:b/>
-          <w:bCs/>
-        </w:rPr>
-        <w:t xml:space="preserve">( to discuss with Montassar) </w:t>
+      <w:proofErr w:type="gramStart"/>
+      <w:r>
+        <w:rPr>
+          <w:b/>
+          <w:bCs/>
+        </w:rPr>
+        <w:t>( to</w:t>
+      </w:r>
+      <w:proofErr w:type="gramEnd"/>
+      <w:r>
+        <w:rPr>
+          <w:b/>
+          <w:bCs/>
+        </w:rPr>
+        <w:t xml:space="preserve"> discuss with </w:t>
+      </w:r>
+      <w:proofErr w:type="spellStart"/>
+      <w:r>
+        <w:rPr>
+          <w:b/>
+          <w:bCs/>
+        </w:rPr>
+        <w:t>Montassar</w:t>
+      </w:r>
+      <w:proofErr w:type="spellEnd"/>
+      <w:r>
+        <w:rPr>
+          <w:b/>
+          <w:bCs/>
+        </w:rPr>
+        <w:t xml:space="preserve">) </w:t>
       </w:r>
     </w:p>
     <w:p>
@@ -1469,10 +1956,26 @@
         <w:t>Fetch new data</w:t>
       </w:r>
       <w:r>
-        <w:t xml:space="preserve"> from coinGecko Api</w:t>
-      </w:r>
-      <w:r>
-        <w:t xml:space="preserve"> ( daily </w:t>
+        <w:t xml:space="preserve"> from </w:t>
+      </w:r>
+      <w:proofErr w:type="spellStart"/>
+      <w:r>
+        <w:t>coinGecko</w:t>
+      </w:r>
+      <w:proofErr w:type="spellEnd"/>
+      <w:r>
+        <w:t xml:space="preserve"> Api</w:t>
+      </w:r>
+      <w:r>
+        <w:t xml:space="preserve"> </w:t>
+      </w:r>
+      <w:proofErr w:type="gramStart"/>
+      <w:r>
+        <w:t>( daily</w:t>
+      </w:r>
+      <w:proofErr w:type="gramEnd"/>
+      <w:r>
+        <w:t xml:space="preserve"> </w:t>
       </w:r>
       <w:r>
         <w:t>)</w:t>
@@ -1533,7 +2036,23 @@
         <w:t>Track rolling error</w:t>
       </w:r>
       <w:r>
-        <w:t xml:space="preserve"> ( ex last 30 days ) </w:t>
+        <w:t xml:space="preserve"> </w:t>
+      </w:r>
+      <w:proofErr w:type="gramStart"/>
+      <w:r>
+        <w:t>( ex</w:t>
+      </w:r>
+      <w:proofErr w:type="gramEnd"/>
+      <w:r>
+        <w:t xml:space="preserve"> last 30 </w:t>
+      </w:r>
+      <w:proofErr w:type="gramStart"/>
+      <w:r>
+        <w:t>days )</w:t>
+      </w:r>
+      <w:proofErr w:type="gramEnd"/>
+      <w:r>
+        <w:t xml:space="preserve"> </w:t>
       </w:r>
     </w:p>
     <w:p>
@@ -1552,7 +2071,23 @@
         <w:t>retraining</w:t>
       </w:r>
       <w:r>
-        <w:t xml:space="preserve"> is needed ( if the error rate exceeds certain threshold ) </w:t>
+        <w:t xml:space="preserve"> is needed </w:t>
+      </w:r>
+      <w:proofErr w:type="gramStart"/>
+      <w:r>
+        <w:t>( if</w:t>
+      </w:r>
+      <w:proofErr w:type="gramEnd"/>
+      <w:r>
+        <w:t xml:space="preserve"> the error rate exceeds certain </w:t>
+      </w:r>
+      <w:proofErr w:type="gramStart"/>
+      <w:r>
+        <w:t>threshold )</w:t>
+      </w:r>
+      <w:proofErr w:type="gramEnd"/>
+      <w:r>
+        <w:t xml:space="preserve"> </w:t>
       </w:r>
     </w:p>
     <w:p>
@@ -1574,8 +2109,17 @@
           <w:b/>
           <w:bCs/>
         </w:rPr>
-        <w:t>DB type :</w:t>
-      </w:r>
+        <w:t xml:space="preserve">DB </w:t>
+      </w:r>
+      <w:proofErr w:type="gramStart"/>
+      <w:r>
+        <w:rPr>
+          <w:b/>
+          <w:bCs/>
+        </w:rPr>
+        <w:t>type :</w:t>
+      </w:r>
+      <w:proofErr w:type="gramEnd"/>
       <w:r>
         <w:t xml:space="preserve"> </w:t>
       </w:r>
@@ -1604,17 +2148,28 @@
           <w:b/>
           <w:bCs/>
         </w:rPr>
-        <w:t>Expected size :</w:t>
-      </w:r>
+        <w:t xml:space="preserve">Expected </w:t>
+      </w:r>
+      <w:proofErr w:type="gramStart"/>
+      <w:r>
+        <w:rPr>
+          <w:b/>
+          <w:bCs/>
+        </w:rPr>
+        <w:t>size :</w:t>
+      </w:r>
+      <w:proofErr w:type="gramEnd"/>
       <w:r>
         <w:t xml:space="preserve"> </w:t>
       </w:r>
       <w:r>
         <w:t xml:space="preserve">If </w:t>
       </w:r>
+      <w:proofErr w:type="spellStart"/>
       <w:r>
         <w:t>i</w:t>
       </w:r>
+      <w:proofErr w:type="spellEnd"/>
       <w:r>
         <w:t xml:space="preserve"> store 1 coin hourly for 5 years: </w:t>
       </w:r>
@@ -1665,7 +2220,23 @@
           <w:b/>
           <w:bCs/>
         </w:rPr>
-        <w:t xml:space="preserve">Tables to store : </w:t>
+        <w:t xml:space="preserve">Tables to </w:t>
+      </w:r>
+      <w:proofErr w:type="gramStart"/>
+      <w:r>
+        <w:rPr>
+          <w:b/>
+          <w:bCs/>
+        </w:rPr>
+        <w:t>store :</w:t>
+      </w:r>
+      <w:proofErr w:type="gramEnd"/>
+      <w:r>
+        <w:rPr>
+          <w:b/>
+          <w:bCs/>
+        </w:rPr>
+        <w:t xml:space="preserve"> </w:t>
       </w:r>
     </w:p>
     <w:p>
@@ -1677,7 +2248,15 @@
         </w:numPr>
       </w:pPr>
       <w:r>
-        <w:t xml:space="preserve">raw price -&gt; daily live prices fetched from coinGeko </w:t>
+        <w:t xml:space="preserve">raw price -&gt; daily live prices fetched from </w:t>
+      </w:r>
+      <w:proofErr w:type="spellStart"/>
+      <w:r>
+        <w:t>coinGeko</w:t>
+      </w:r>
+      <w:proofErr w:type="spellEnd"/>
+      <w:r>
+        <w:t xml:space="preserve"> </w:t>
       </w:r>
     </w:p>
     <w:p>
@@ -1712,7 +2291,39 @@
         <w:t>Timestamps</w:t>
       </w:r>
       <w:r>
-        <w:t xml:space="preserve"> are important every prediction should be related to a target timestamp to know when the new data is available , example target timestamp is tomorrow we store it’s prediction today and save it in the prediction table . when tomorrows closing price is available in the raw price table e make the comparison , calculate the error and store it in errors table </w:t>
+        <w:t xml:space="preserve"> are important every prediction should be related to a target timestamp to know when the new data is </w:t>
+      </w:r>
+      <w:proofErr w:type="gramStart"/>
+      <w:r>
+        <w:t>available ,</w:t>
+      </w:r>
+      <w:proofErr w:type="gramEnd"/>
+      <w:r>
+        <w:t xml:space="preserve"> example target timestamp is tomorrow we store </w:t>
+      </w:r>
+      <w:proofErr w:type="gramStart"/>
+      <w:r>
+        <w:t>it’s</w:t>
+      </w:r>
+      <w:proofErr w:type="gramEnd"/>
+      <w:r>
+        <w:t xml:space="preserve"> prediction today and save it in the prediction </w:t>
+      </w:r>
+      <w:proofErr w:type="gramStart"/>
+      <w:r>
+        <w:t>table .</w:t>
+      </w:r>
+      <w:proofErr w:type="gramEnd"/>
+      <w:r>
+        <w:t xml:space="preserve"> when tomorrows closing price is available in the raw price table e make the </w:t>
+      </w:r>
+      <w:proofErr w:type="gramStart"/>
+      <w:r>
+        <w:t>comparison ,</w:t>
+      </w:r>
+      <w:proofErr w:type="gramEnd"/>
+      <w:r>
+        <w:t xml:space="preserve"> calculate the error and store it in errors table </w:t>
       </w:r>
     </w:p>
     <w:p>
@@ -1727,6 +2338,7 @@
           <w:bCs/>
         </w:rPr>
       </w:pPr>
+      <w:proofErr w:type="gramStart"/>
       <w:r>
         <w:rPr>
           <w:b/>
@@ -1739,7 +2351,15 @@
           <w:b/>
           <w:bCs/>
         </w:rPr>
-        <w:t xml:space="preserve"> : </w:t>
+        <w:t xml:space="preserve"> :</w:t>
+      </w:r>
+      <w:proofErr w:type="gramEnd"/>
+      <w:r>
+        <w:rPr>
+          <w:b/>
+          <w:bCs/>
+        </w:rPr>
+        <w:t xml:space="preserve"> </w:t>
       </w:r>
     </w:p>
     <w:p>
@@ -1756,7 +2376,15 @@
         <w:pStyle w:val="ListParagraph"/>
       </w:pPr>
       <w:r>
-        <w:t xml:space="preserve">[CoinGecko API] </w:t>
+        <w:t>[</w:t>
+      </w:r>
+      <w:proofErr w:type="spellStart"/>
+      <w:r>
+        <w:t>CoinGecko</w:t>
+      </w:r>
+      <w:proofErr w:type="spellEnd"/>
+      <w:r>
+        <w:t xml:space="preserve"> API] </w:t>
       </w:r>
     </w:p>
     <w:p>
@@ -1786,7 +2414,15 @@
         <w:pStyle w:val="ListParagraph"/>
       </w:pPr>
       <w:r>
-        <w:t xml:space="preserve">  raw_prices table</w:t>
+        <w:t xml:space="preserve">  </w:t>
+      </w:r>
+      <w:proofErr w:type="spellStart"/>
+      <w:r>
+        <w:t>raw_prices</w:t>
+      </w:r>
+      <w:proofErr w:type="spellEnd"/>
+      <w:r>
+        <w:t xml:space="preserve"> table</w:t>
       </w:r>
     </w:p>
     <w:p>
@@ -1846,7 +2482,31 @@
         <w:pStyle w:val="ListParagraph"/>
       </w:pPr>
       <w:r>
-        <w:t>Compare predicted_price with true_price (from raw_prices)</w:t>
+        <w:t xml:space="preserve">Compare </w:t>
+      </w:r>
+      <w:proofErr w:type="spellStart"/>
+      <w:r>
+        <w:t>predicted_price</w:t>
+      </w:r>
+      <w:proofErr w:type="spellEnd"/>
+      <w:r>
+        <w:t xml:space="preserve"> with </w:t>
+      </w:r>
+      <w:proofErr w:type="spellStart"/>
+      <w:r>
+        <w:t>true_price</w:t>
+      </w:r>
+      <w:proofErr w:type="spellEnd"/>
+      <w:r>
+        <w:t xml:space="preserve"> (from </w:t>
+      </w:r>
+      <w:proofErr w:type="spellStart"/>
+      <w:r>
+        <w:t>raw_prices</w:t>
+      </w:r>
+      <w:proofErr w:type="spellEnd"/>
+      <w:r>
+        <w:t>)</w:t>
       </w:r>
     </w:p>
     <w:p>
@@ -1906,7 +2566,15 @@
         <w:pStyle w:val="ListParagraph"/>
       </w:pPr>
       <w:r>
-        <w:t>If rolling error &gt; threshold → retraining_log table → retrain model</w:t>
+        <w:t xml:space="preserve">If rolling error &gt; threshold → </w:t>
+      </w:r>
+      <w:proofErr w:type="spellStart"/>
+      <w:r>
+        <w:t>retraining_log</w:t>
+      </w:r>
+      <w:proofErr w:type="spellEnd"/>
+      <w:r>
+        <w:t xml:space="preserve"> table → retrain model</w:t>
       </w:r>
     </w:p>
     <w:p>
@@ -1937,7 +2605,31 @@
         <w:sym w:font="Wingdings" w:char="F0E0"/>
       </w:r>
       <w:r>
-        <w:t xml:space="preserve"> the prediction should be done using as input the live data , the user is not supposed to enter manually technical data to get the response ( what is the prediction for BTC tomorrow ) </w:t>
+        <w:t xml:space="preserve"> the prediction should be done using as input the live </w:t>
+      </w:r>
+      <w:proofErr w:type="gramStart"/>
+      <w:r>
+        <w:t>data ,</w:t>
+      </w:r>
+      <w:proofErr w:type="gramEnd"/>
+      <w:r>
+        <w:t xml:space="preserve"> the user is not supposed to enter manually technical data to get the response </w:t>
+      </w:r>
+      <w:proofErr w:type="gramStart"/>
+      <w:r>
+        <w:t>( what</w:t>
+      </w:r>
+      <w:proofErr w:type="gramEnd"/>
+      <w:r>
+        <w:t xml:space="preserve"> is the prediction for BTC </w:t>
+      </w:r>
+      <w:proofErr w:type="gramStart"/>
+      <w:r>
+        <w:t>tomorrow )</w:t>
+      </w:r>
+      <w:proofErr w:type="gramEnd"/>
+      <w:r>
+        <w:t xml:space="preserve"> </w:t>
       </w:r>
     </w:p>
     <w:p>
@@ -1997,7 +2689,15 @@
         <w:ind w:left="1800"/>
       </w:pPr>
       <w:r>
-        <w:t>Fetch live data from a crypto API (CoinGecko)</w:t>
+        <w:t>Fetch live data from a crypto API (</w:t>
+      </w:r>
+      <w:proofErr w:type="spellStart"/>
+      <w:r>
+        <w:t>CoinGecko</w:t>
+      </w:r>
+      <w:proofErr w:type="spellEnd"/>
+      <w:r>
+        <w:t>)</w:t>
       </w:r>
     </w:p>
     <w:p>
@@ -2010,8 +2710,13 @@
         <w:ind w:left="1800"/>
       </w:pPr>
       <w:r>
-        <w:t>Preprocess the data and compute technical indicators ( RSI ..</w:t>
-      </w:r>
+        <w:t xml:space="preserve">Preprocess the data and compute technical indicators </w:t>
+      </w:r>
+      <w:proofErr w:type="gramStart"/>
+      <w:r>
+        <w:t>( RSI ..</w:t>
+      </w:r>
+      <w:proofErr w:type="gramEnd"/>
       <w:r>
         <w:t xml:space="preserve">) the ones we added in the EDA part </w:t>
       </w:r>
@@ -2100,13 +2805,35 @@
         <w:rPr>
           <w:color w:val="000000" w:themeColor="text1"/>
         </w:rPr>
-        <w:t xml:space="preserve">Price prediction using different models </w:t>
-      </w:r>
-      <w:r>
-        <w:rPr>
-          <w:color w:val="000000" w:themeColor="text1"/>
-        </w:rPr>
-        <w:t xml:space="preserve">ex : </w:t>
+        <w:t xml:space="preserve">Price prediction using different </w:t>
+      </w:r>
+      <w:proofErr w:type="gramStart"/>
+      <w:r>
+        <w:rPr>
+          <w:color w:val="000000" w:themeColor="text1"/>
+        </w:rPr>
+        <w:t>models</w:t>
+      </w:r>
+      <w:proofErr w:type="gramEnd"/>
+      <w:r>
+        <w:rPr>
+          <w:color w:val="000000" w:themeColor="text1"/>
+        </w:rPr>
+        <w:t xml:space="preserve"> </w:t>
+      </w:r>
+      <w:proofErr w:type="gramStart"/>
+      <w:r>
+        <w:rPr>
+          <w:color w:val="000000" w:themeColor="text1"/>
+        </w:rPr>
+        <w:t>ex :</w:t>
+      </w:r>
+      <w:proofErr w:type="gramEnd"/>
+      <w:r>
+        <w:rPr>
+          <w:color w:val="000000" w:themeColor="text1"/>
+        </w:rPr>
+        <w:t xml:space="preserve"> </w:t>
       </w:r>
     </w:p>
     <w:p>
@@ -2153,11 +2880,19 @@
           <w:color w:val="000000" w:themeColor="text1"/>
         </w:rPr>
       </w:pPr>
-      <w:r>
-        <w:rPr>
-          <w:color w:val="000000" w:themeColor="text1"/>
-        </w:rPr>
-        <w:t>XGBoost Regressor</w:t>
+      <w:proofErr w:type="spellStart"/>
+      <w:r>
+        <w:rPr>
+          <w:color w:val="000000" w:themeColor="text1"/>
+        </w:rPr>
+        <w:t>XGBoost</w:t>
+      </w:r>
+      <w:proofErr w:type="spellEnd"/>
+      <w:r>
+        <w:rPr>
+          <w:color w:val="000000" w:themeColor="text1"/>
+        </w:rPr>
+        <w:t xml:space="preserve"> Regressor</w:t>
       </w:r>
       <w:r>
         <w:rPr>
@@ -2176,8 +2911,16 @@
         <w:rPr>
           <w:color w:val="000000" w:themeColor="text1"/>
         </w:rPr>
-        <w:t>Choose the best performance and make a deep evaluation of it :</w:t>
-      </w:r>
+        <w:t xml:space="preserve">Choose the best performance and make a deep evaluation of </w:t>
+      </w:r>
+      <w:proofErr w:type="gramStart"/>
+      <w:r>
+        <w:rPr>
+          <w:color w:val="000000" w:themeColor="text1"/>
+        </w:rPr>
+        <w:t>it :</w:t>
+      </w:r>
+      <w:proofErr w:type="gramEnd"/>
     </w:p>
     <w:p>
       <w:pPr>
@@ -2334,7 +3077,29 @@
           <w:sz w:val="32"/>
           <w:szCs w:val="32"/>
         </w:rPr>
-        <w:t xml:space="preserve">Deep Learning with Long Short-Term Memory ( important ) </w:t>
+        <w:t xml:space="preserve">Deep Learning with Long Short-Term Memory </w:t>
+      </w:r>
+      <w:proofErr w:type="gramStart"/>
+      <w:r>
+        <w:rPr>
+          <w:b/>
+          <w:bCs/>
+          <w:color w:val="C00000"/>
+          <w:sz w:val="32"/>
+          <w:szCs w:val="32"/>
+        </w:rPr>
+        <w:t>( important</w:t>
+      </w:r>
+      <w:proofErr w:type="gramEnd"/>
+      <w:r>
+        <w:rPr>
+          <w:b/>
+          <w:bCs/>
+          <w:color w:val="C00000"/>
+          <w:sz w:val="32"/>
+          <w:szCs w:val="32"/>
+        </w:rPr>
+        <w:t xml:space="preserve"> ) </w:t>
       </w:r>
     </w:p>
     <w:p>
@@ -2374,7 +3139,21 @@
         <w:rPr>
           <w:color w:val="000000" w:themeColor="text1"/>
         </w:rPr>
-        <w:t xml:space="preserve">To predict the future price ,we need to train the model on a long history of prices </w:t>
+        <w:t xml:space="preserve">To predict the future </w:t>
+      </w:r>
+      <w:proofErr w:type="gramStart"/>
+      <w:r>
+        <w:rPr>
+          <w:color w:val="000000" w:themeColor="text1"/>
+        </w:rPr>
+        <w:t>price ,we</w:t>
+      </w:r>
+      <w:proofErr w:type="gramEnd"/>
+      <w:r>
+        <w:rPr>
+          <w:color w:val="000000" w:themeColor="text1"/>
+        </w:rPr>
+        <w:t xml:space="preserve"> need to train the model on a long history of prices </w:t>
       </w:r>
     </w:p>
     <w:p>
@@ -2441,7 +3220,21 @@
         <w:rPr>
           <w:color w:val="000000" w:themeColor="text1"/>
         </w:rPr>
-        <w:t>Normalize features (MinMaxScaler)</w:t>
+        <w:t>Normalize features (</w:t>
+      </w:r>
+      <w:proofErr w:type="spellStart"/>
+      <w:r>
+        <w:rPr>
+          <w:color w:val="000000" w:themeColor="text1"/>
+        </w:rPr>
+        <w:t>MinMaxScaler</w:t>
+      </w:r>
+      <w:proofErr w:type="spellEnd"/>
+      <w:r>
+        <w:rPr>
+          <w:color w:val="000000" w:themeColor="text1"/>
+        </w:rPr>
+        <w:t>)</w:t>
       </w:r>
     </w:p>
     <w:p>
@@ -2464,7 +3257,21 @@
         <w:rPr>
           <w:color w:val="000000" w:themeColor="text1"/>
         </w:rPr>
-        <w:t xml:space="preserve"> example look to the n=3 last days to predict tomorrows price </w:t>
+        <w:t xml:space="preserve"> example look to the n=3 last days to predict </w:t>
+      </w:r>
+      <w:proofErr w:type="gramStart"/>
+      <w:r>
+        <w:rPr>
+          <w:color w:val="000000" w:themeColor="text1"/>
+        </w:rPr>
+        <w:t>tomorrows</w:t>
+      </w:r>
+      <w:proofErr w:type="gramEnd"/>
+      <w:r>
+        <w:rPr>
+          <w:color w:val="000000" w:themeColor="text1"/>
+        </w:rPr>
+        <w:t xml:space="preserve"> price </w:t>
       </w:r>
     </w:p>
     <w:p>
@@ -2622,13 +3429,27 @@
         <w:rPr>
           <w:color w:val="000000" w:themeColor="text1"/>
         </w:rPr>
-        <w:t xml:space="preserve">The output of  </w:t>
-      </w:r>
-      <w:r>
-        <w:rPr>
-          <w:color w:val="000000" w:themeColor="text1"/>
-        </w:rPr>
-        <w:t>the deep learning</w:t>
+        <w:t xml:space="preserve">The output </w:t>
+      </w:r>
+      <w:proofErr w:type="gramStart"/>
+      <w:r>
+        <w:rPr>
+          <w:color w:val="000000" w:themeColor="text1"/>
+        </w:rPr>
+        <w:t xml:space="preserve">of  </w:t>
+      </w:r>
+      <w:r>
+        <w:rPr>
+          <w:color w:val="000000" w:themeColor="text1"/>
+        </w:rPr>
+        <w:t>the</w:t>
+      </w:r>
+      <w:proofErr w:type="gramEnd"/>
+      <w:r>
+        <w:rPr>
+          <w:color w:val="000000" w:themeColor="text1"/>
+        </w:rPr>
+        <w:t xml:space="preserve"> deep learning</w:t>
       </w:r>
       <w:r>
         <w:rPr>
@@ -2642,6 +3463,7 @@
         </w:rPr>
         <w:t xml:space="preserve"> </w:t>
       </w:r>
+      <w:proofErr w:type="gramStart"/>
       <w:r>
         <w:rPr>
           <w:color w:val="000000" w:themeColor="text1"/>
@@ -2652,7 +3474,14 @@
         <w:rPr>
           <w:color w:val="000000" w:themeColor="text1"/>
         </w:rPr>
-        <w:t xml:space="preserve">real time </w:t>
+        <w:t>real</w:t>
+      </w:r>
+      <w:proofErr w:type="gramEnd"/>
+      <w:r>
+        <w:rPr>
+          <w:color w:val="000000" w:themeColor="text1"/>
+        </w:rPr>
+        <w:t xml:space="preserve"> time </w:t>
       </w:r>
       <w:r>
         <w:rPr>
@@ -2693,44 +3522,136 @@
         <w:rPr>
           <w:color w:val="000000" w:themeColor="text1"/>
         </w:rPr>
-        <w:t>xternal context (politics</w:t>
-      </w:r>
-      <w:r>
-        <w:rPr>
-          <w:color w:val="000000" w:themeColor="text1"/>
-        </w:rPr>
-        <w:t xml:space="preserve"> , wars </w:t>
-      </w:r>
-      <w:r>
-        <w:rPr>
-          <w:color w:val="000000" w:themeColor="text1"/>
-        </w:rPr>
-        <w:t>, regulation</w:t>
-      </w:r>
-      <w:r>
-        <w:rPr>
-          <w:color w:val="000000" w:themeColor="text1"/>
-        </w:rPr>
-        <w:t xml:space="preserve"> , tax politique , interest rate cuts </w:t>
-      </w:r>
-      <w:r>
-        <w:rPr>
-          <w:color w:val="000000" w:themeColor="text1"/>
-        </w:rPr>
-        <w:t>, macroeconomics, major news)</w:t>
-      </w:r>
+        <w:t>xternal context (</w:t>
+      </w:r>
+      <w:proofErr w:type="gramStart"/>
+      <w:r>
+        <w:rPr>
+          <w:color w:val="000000" w:themeColor="text1"/>
+        </w:rPr>
+        <w:t>politics</w:t>
+      </w:r>
+      <w:r>
+        <w:rPr>
+          <w:color w:val="000000" w:themeColor="text1"/>
+        </w:rPr>
+        <w:t xml:space="preserve"> ,</w:t>
+      </w:r>
+      <w:proofErr w:type="gramEnd"/>
       <w:r>
         <w:rPr>
           <w:color w:val="000000" w:themeColor="text1"/>
         </w:rPr>
         <w:t xml:space="preserve"> </w:t>
       </w:r>
-      <w:r>
-        <w:rPr>
-          <w:color w:val="000000" w:themeColor="text1"/>
-        </w:rPr>
-        <w:t>from the web ( very important )</w:t>
-      </w:r>
+      <w:proofErr w:type="gramStart"/>
+      <w:r>
+        <w:rPr>
+          <w:color w:val="000000" w:themeColor="text1"/>
+        </w:rPr>
+        <w:t xml:space="preserve">wars </w:t>
+      </w:r>
+      <w:r>
+        <w:rPr>
+          <w:color w:val="000000" w:themeColor="text1"/>
+        </w:rPr>
+        <w:t>,</w:t>
+      </w:r>
+      <w:proofErr w:type="gramEnd"/>
+      <w:r>
+        <w:rPr>
+          <w:color w:val="000000" w:themeColor="text1"/>
+        </w:rPr>
+        <w:t xml:space="preserve"> </w:t>
+      </w:r>
+      <w:proofErr w:type="gramStart"/>
+      <w:r>
+        <w:rPr>
+          <w:color w:val="000000" w:themeColor="text1"/>
+        </w:rPr>
+        <w:t>regulation</w:t>
+      </w:r>
+      <w:r>
+        <w:rPr>
+          <w:color w:val="000000" w:themeColor="text1"/>
+        </w:rPr>
+        <w:t xml:space="preserve"> ,</w:t>
+      </w:r>
+      <w:proofErr w:type="gramEnd"/>
+      <w:r>
+        <w:rPr>
+          <w:color w:val="000000" w:themeColor="text1"/>
+        </w:rPr>
+        <w:t xml:space="preserve"> tax </w:t>
+      </w:r>
+      <w:proofErr w:type="gramStart"/>
+      <w:r>
+        <w:rPr>
+          <w:color w:val="000000" w:themeColor="text1"/>
+        </w:rPr>
+        <w:t>politique ,</w:t>
+      </w:r>
+      <w:proofErr w:type="gramEnd"/>
+      <w:r>
+        <w:rPr>
+          <w:color w:val="000000" w:themeColor="text1"/>
+        </w:rPr>
+        <w:t xml:space="preserve"> interest rate </w:t>
+      </w:r>
+      <w:proofErr w:type="gramStart"/>
+      <w:r>
+        <w:rPr>
+          <w:color w:val="000000" w:themeColor="text1"/>
+        </w:rPr>
+        <w:t xml:space="preserve">cuts </w:t>
+      </w:r>
+      <w:r>
+        <w:rPr>
+          <w:color w:val="000000" w:themeColor="text1"/>
+        </w:rPr>
+        <w:t>,</w:t>
+      </w:r>
+      <w:proofErr w:type="gramEnd"/>
+      <w:r>
+        <w:rPr>
+          <w:color w:val="000000" w:themeColor="text1"/>
+        </w:rPr>
+        <w:t xml:space="preserve"> macroeconomics, major news)</w:t>
+      </w:r>
+      <w:r>
+        <w:rPr>
+          <w:color w:val="000000" w:themeColor="text1"/>
+        </w:rPr>
+        <w:t xml:space="preserve"> </w:t>
+      </w:r>
+      <w:r>
+        <w:rPr>
+          <w:color w:val="000000" w:themeColor="text1"/>
+        </w:rPr>
+        <w:t xml:space="preserve">from the web </w:t>
+      </w:r>
+      <w:proofErr w:type="gramStart"/>
+      <w:r>
+        <w:rPr>
+          <w:color w:val="000000" w:themeColor="text1"/>
+        </w:rPr>
+        <w:t>( very</w:t>
+      </w:r>
+      <w:proofErr w:type="gramEnd"/>
+      <w:r>
+        <w:rPr>
+          <w:color w:val="000000" w:themeColor="text1"/>
+        </w:rPr>
+        <w:t xml:space="preserve"> </w:t>
+      </w:r>
+      <w:proofErr w:type="gramStart"/>
+      <w:r>
+        <w:rPr>
+          <w:color w:val="000000" w:themeColor="text1"/>
+        </w:rPr>
+        <w:t>important )</w:t>
+      </w:r>
+      <w:proofErr w:type="gramEnd"/>
     </w:p>
     <w:p>
       <w:pPr>
@@ -2777,21 +3698,32 @@
           <w:color w:val="000000" w:themeColor="text1"/>
         </w:rPr>
       </w:pPr>
-      <w:r>
-        <w:rPr>
-          <w:b/>
-          <w:bCs/>
-          <w:color w:val="000000" w:themeColor="text1"/>
-        </w:rPr>
-        <w:t xml:space="preserve">Example : </w:t>
-      </w:r>
-    </w:p>
-    <w:p>
-      <w:pPr>
-        <w:rPr>
-          <w:color w:val="000000" w:themeColor="text1"/>
-        </w:rPr>
-      </w:pPr>
+      <w:proofErr w:type="gramStart"/>
+      <w:r>
+        <w:rPr>
+          <w:b/>
+          <w:bCs/>
+          <w:color w:val="000000" w:themeColor="text1"/>
+        </w:rPr>
+        <w:t>Example :</w:t>
+      </w:r>
+      <w:proofErr w:type="gramEnd"/>
+      <w:r>
+        <w:rPr>
+          <w:b/>
+          <w:bCs/>
+          <w:color w:val="000000" w:themeColor="text1"/>
+        </w:rPr>
+        <w:t xml:space="preserve"> </w:t>
+      </w:r>
+    </w:p>
+    <w:p>
+      <w:pPr>
+        <w:rPr>
+          <w:color w:val="000000" w:themeColor="text1"/>
+        </w:rPr>
+      </w:pPr>
+      <w:proofErr w:type="gramStart"/>
       <w:r>
         <w:rPr>
           <w:b/>
@@ -2800,19 +3732,35 @@
         </w:rPr>
         <w:t>Question :</w:t>
       </w:r>
-      <w:r>
-        <w:rPr>
-          <w:color w:val="000000" w:themeColor="text1"/>
-        </w:rPr>
-        <w:t xml:space="preserve"> what are bitcoin predictions this week ? </w:t>
-      </w:r>
-    </w:p>
-    <w:p>
-      <w:pPr>
-        <w:rPr>
-          <w:color w:val="000000" w:themeColor="text1"/>
-        </w:rPr>
-      </w:pPr>
+      <w:proofErr w:type="gramEnd"/>
+      <w:r>
+        <w:rPr>
+          <w:color w:val="000000" w:themeColor="text1"/>
+        </w:rPr>
+        <w:t xml:space="preserve"> what are bitcoin predictions this </w:t>
+      </w:r>
+      <w:proofErr w:type="gramStart"/>
+      <w:r>
+        <w:rPr>
+          <w:color w:val="000000" w:themeColor="text1"/>
+        </w:rPr>
+        <w:t>week ?</w:t>
+      </w:r>
+      <w:proofErr w:type="gramEnd"/>
+      <w:r>
+        <w:rPr>
+          <w:color w:val="000000" w:themeColor="text1"/>
+        </w:rPr>
+        <w:t xml:space="preserve"> </w:t>
+      </w:r>
+    </w:p>
+    <w:p>
+      <w:pPr>
+        <w:rPr>
+          <w:color w:val="000000" w:themeColor="text1"/>
+        </w:rPr>
+      </w:pPr>
+      <w:proofErr w:type="gramStart"/>
       <w:r>
         <w:rPr>
           <w:b/>
@@ -2821,6 +3769,7 @@
         </w:rPr>
         <w:t>Response :</w:t>
       </w:r>
+      <w:proofErr w:type="gramEnd"/>
       <w:r>
         <w:rPr>
           <w:color w:val="000000" w:themeColor="text1"/>
@@ -2874,7 +3823,25 @@
           <w:bCs/>
           <w:color w:val="000000" w:themeColor="text1"/>
         </w:rPr>
-        <w:t xml:space="preserve">Pipeline looks like this : </w:t>
+        <w:t xml:space="preserve">Pipeline looks like </w:t>
+      </w:r>
+      <w:proofErr w:type="gramStart"/>
+      <w:r>
+        <w:rPr>
+          <w:b/>
+          <w:bCs/>
+          <w:color w:val="000000" w:themeColor="text1"/>
+        </w:rPr>
+        <w:t>this :</w:t>
+      </w:r>
+      <w:proofErr w:type="gramEnd"/>
+      <w:r>
+        <w:rPr>
+          <w:b/>
+          <w:bCs/>
+          <w:color w:val="000000" w:themeColor="text1"/>
+        </w:rPr>
+        <w:t xml:space="preserve"> </w:t>
       </w:r>
     </w:p>
     <w:p>
@@ -2913,13 +3880,41 @@
         <w:rPr>
           <w:color w:val="000000" w:themeColor="text1"/>
         </w:rPr>
-        <w:t>Fetch latest crypto data (CoinGecko)</w:t>
-      </w:r>
-      <w:r>
-        <w:rPr>
-          <w:color w:val="000000" w:themeColor="text1"/>
-        </w:rPr>
-        <w:t xml:space="preserve"> we use crypto api our data is always up to date </w:t>
+        <w:t>Fetch latest crypto data (</w:t>
+      </w:r>
+      <w:proofErr w:type="spellStart"/>
+      <w:r>
+        <w:rPr>
+          <w:color w:val="000000" w:themeColor="text1"/>
+        </w:rPr>
+        <w:t>CoinGecko</w:t>
+      </w:r>
+      <w:proofErr w:type="spellEnd"/>
+      <w:r>
+        <w:rPr>
+          <w:color w:val="000000" w:themeColor="text1"/>
+        </w:rPr>
+        <w:t>)</w:t>
+      </w:r>
+      <w:r>
+        <w:rPr>
+          <w:color w:val="000000" w:themeColor="text1"/>
+        </w:rPr>
+        <w:t xml:space="preserve"> we use crypto </w:t>
+      </w:r>
+      <w:proofErr w:type="spellStart"/>
+      <w:r>
+        <w:rPr>
+          <w:color w:val="000000" w:themeColor="text1"/>
+        </w:rPr>
+        <w:t>api</w:t>
+      </w:r>
+      <w:proofErr w:type="spellEnd"/>
+      <w:r>
+        <w:rPr>
+          <w:color w:val="000000" w:themeColor="text1"/>
+        </w:rPr>
+        <w:t xml:space="preserve"> our data is always up to date </w:t>
       </w:r>
     </w:p>
     <w:p>
@@ -2951,8 +3946,44 @@
         <w:rPr>
           <w:color w:val="000000" w:themeColor="text1"/>
         </w:rPr>
-        <w:t xml:space="preserve"> ( get the output if price trend  will go up or down )</w:t>
-      </w:r>
+        <w:t xml:space="preserve"> </w:t>
+      </w:r>
+      <w:proofErr w:type="gramStart"/>
+      <w:r>
+        <w:rPr>
+          <w:color w:val="000000" w:themeColor="text1"/>
+        </w:rPr>
+        <w:t>( get</w:t>
+      </w:r>
+      <w:proofErr w:type="gramEnd"/>
+      <w:r>
+        <w:rPr>
+          <w:color w:val="000000" w:themeColor="text1"/>
+        </w:rPr>
+        <w:t xml:space="preserve"> the output if price </w:t>
+      </w:r>
+      <w:proofErr w:type="gramStart"/>
+      <w:r>
+        <w:rPr>
+          <w:color w:val="000000" w:themeColor="text1"/>
+        </w:rPr>
+        <w:t>trend  will</w:t>
+      </w:r>
+      <w:proofErr w:type="gramEnd"/>
+      <w:r>
+        <w:rPr>
+          <w:color w:val="000000" w:themeColor="text1"/>
+        </w:rPr>
+        <w:t xml:space="preserve"> go up or </w:t>
+      </w:r>
+      <w:proofErr w:type="gramStart"/>
+      <w:r>
+        <w:rPr>
+          <w:color w:val="000000" w:themeColor="text1"/>
+        </w:rPr>
+        <w:t>down )</w:t>
+      </w:r>
+      <w:proofErr w:type="gramEnd"/>
     </w:p>
     <w:p>
       <w:pPr>
@@ -2977,13 +4008,49 @@
         <w:rPr>
           <w:color w:val="000000" w:themeColor="text1"/>
         </w:rPr>
-        <w:t>Fetch recent news via Tavily</w:t>
-      </w:r>
-      <w:r>
-        <w:rPr>
-          <w:color w:val="000000" w:themeColor="text1"/>
-        </w:rPr>
-        <w:t xml:space="preserve"> ( collect political and economic last news ) </w:t>
+        <w:t xml:space="preserve">Fetch recent news via </w:t>
+      </w:r>
+      <w:proofErr w:type="spellStart"/>
+      <w:r>
+        <w:rPr>
+          <w:color w:val="000000" w:themeColor="text1"/>
+        </w:rPr>
+        <w:t>Tavily</w:t>
+      </w:r>
+      <w:proofErr w:type="spellEnd"/>
+      <w:r>
+        <w:rPr>
+          <w:color w:val="000000" w:themeColor="text1"/>
+        </w:rPr>
+        <w:t xml:space="preserve"> </w:t>
+      </w:r>
+      <w:proofErr w:type="gramStart"/>
+      <w:r>
+        <w:rPr>
+          <w:color w:val="000000" w:themeColor="text1"/>
+        </w:rPr>
+        <w:t>( collect</w:t>
+      </w:r>
+      <w:proofErr w:type="gramEnd"/>
+      <w:r>
+        <w:rPr>
+          <w:color w:val="000000" w:themeColor="text1"/>
+        </w:rPr>
+        <w:t xml:space="preserve"> political and economic last </w:t>
+      </w:r>
+      <w:proofErr w:type="gramStart"/>
+      <w:r>
+        <w:rPr>
+          <w:color w:val="000000" w:themeColor="text1"/>
+        </w:rPr>
+        <w:t>news )</w:t>
+      </w:r>
+      <w:proofErr w:type="gramEnd"/>
+      <w:r>
+        <w:rPr>
+          <w:color w:val="000000" w:themeColor="text1"/>
+        </w:rPr>
+        <w:t xml:space="preserve"> </w:t>
       </w:r>
     </w:p>
     <w:p>
@@ -3041,33 +4108,97 @@
         <w:rPr>
           <w:color w:val="000000" w:themeColor="text1"/>
         </w:rPr>
-        <w:t xml:space="preserve"> ( using web and LSTM output ) </w:t>
-      </w:r>
-    </w:p>
-    <w:p>
-      <w:pPr>
-        <w:rPr>
-          <w:color w:val="000000" w:themeColor="text1"/>
-        </w:rPr>
-      </w:pPr>
-    </w:p>
-    <w:p>
-      <w:pPr>
-        <w:rPr>
-          <w:color w:val="000000" w:themeColor="text1"/>
-        </w:rPr>
-      </w:pPr>
-      <w:r>
-        <w:rPr>
-          <w:color w:val="000000" w:themeColor="text1"/>
-        </w:rPr>
-        <w:t xml:space="preserve">LLM choice : </w:t>
-      </w:r>
-      <w:r>
-        <w:rPr>
-          <w:color w:val="000000" w:themeColor="text1"/>
-        </w:rPr>
-        <w:t xml:space="preserve">i can search for openAI LLM or </w:t>
+        <w:t xml:space="preserve"> </w:t>
+      </w:r>
+      <w:proofErr w:type="gramStart"/>
+      <w:r>
+        <w:rPr>
+          <w:color w:val="000000" w:themeColor="text1"/>
+        </w:rPr>
+        <w:t>( using</w:t>
+      </w:r>
+      <w:proofErr w:type="gramEnd"/>
+      <w:r>
+        <w:rPr>
+          <w:color w:val="000000" w:themeColor="text1"/>
+        </w:rPr>
+        <w:t xml:space="preserve"> web and LSTM </w:t>
+      </w:r>
+      <w:proofErr w:type="gramStart"/>
+      <w:r>
+        <w:rPr>
+          <w:color w:val="000000" w:themeColor="text1"/>
+        </w:rPr>
+        <w:t>output )</w:t>
+      </w:r>
+      <w:proofErr w:type="gramEnd"/>
+      <w:r>
+        <w:rPr>
+          <w:color w:val="000000" w:themeColor="text1"/>
+        </w:rPr>
+        <w:t xml:space="preserve"> </w:t>
+      </w:r>
+    </w:p>
+    <w:p>
+      <w:pPr>
+        <w:rPr>
+          <w:color w:val="000000" w:themeColor="text1"/>
+        </w:rPr>
+      </w:pPr>
+    </w:p>
+    <w:p>
+      <w:pPr>
+        <w:rPr>
+          <w:color w:val="000000" w:themeColor="text1"/>
+        </w:rPr>
+      </w:pPr>
+      <w:r>
+        <w:rPr>
+          <w:color w:val="000000" w:themeColor="text1"/>
+        </w:rPr>
+        <w:t xml:space="preserve">LLM </w:t>
+      </w:r>
+      <w:proofErr w:type="gramStart"/>
+      <w:r>
+        <w:rPr>
+          <w:color w:val="000000" w:themeColor="text1"/>
+        </w:rPr>
+        <w:t>choice :</w:t>
+      </w:r>
+      <w:proofErr w:type="gramEnd"/>
+      <w:r>
+        <w:rPr>
+          <w:color w:val="000000" w:themeColor="text1"/>
+        </w:rPr>
+        <w:t xml:space="preserve"> </w:t>
+      </w:r>
+      <w:proofErr w:type="spellStart"/>
+      <w:r>
+        <w:rPr>
+          <w:color w:val="000000" w:themeColor="text1"/>
+        </w:rPr>
+        <w:t>i</w:t>
+      </w:r>
+      <w:proofErr w:type="spellEnd"/>
+      <w:r>
+        <w:rPr>
+          <w:color w:val="000000" w:themeColor="text1"/>
+        </w:rPr>
+        <w:t xml:space="preserve"> can search for </w:t>
+      </w:r>
+      <w:proofErr w:type="spellStart"/>
+      <w:r>
+        <w:rPr>
+          <w:color w:val="000000" w:themeColor="text1"/>
+        </w:rPr>
+        <w:t>openAI</w:t>
+      </w:r>
+      <w:proofErr w:type="spellEnd"/>
+      <w:r>
+        <w:rPr>
+          <w:color w:val="000000" w:themeColor="text1"/>
+        </w:rPr>
+        <w:t xml:space="preserve"> LLM or </w:t>
       </w:r>
       <w:r>
         <w:rPr>
@@ -3120,7 +4251,21 @@
         <w:rPr>
           <w:color w:val="000000" w:themeColor="text1"/>
         </w:rPr>
-        <w:t xml:space="preserve">Tool options: Streamlit </w:t>
+        <w:t xml:space="preserve">Tool options: </w:t>
+      </w:r>
+      <w:proofErr w:type="spellStart"/>
+      <w:r>
+        <w:rPr>
+          <w:color w:val="000000" w:themeColor="text1"/>
+        </w:rPr>
+        <w:t>Streamlit</w:t>
+      </w:r>
+      <w:proofErr w:type="spellEnd"/>
+      <w:r>
+        <w:rPr>
+          <w:color w:val="000000" w:themeColor="text1"/>
+        </w:rPr>
+        <w:t xml:space="preserve"> </w:t>
       </w:r>
     </w:p>
     <w:p>
@@ -3174,7 +4319,49 @@
         <w:rPr>
           <w:color w:val="000000" w:themeColor="text1"/>
         </w:rPr>
-        <w:t xml:space="preserve"> + technical up to date information ( dominance , market cap , current price , ....) </w:t>
+        <w:t xml:space="preserve"> + technical up to date information </w:t>
+      </w:r>
+      <w:proofErr w:type="gramStart"/>
+      <w:r>
+        <w:rPr>
+          <w:color w:val="000000" w:themeColor="text1"/>
+        </w:rPr>
+        <w:t>( dominance</w:t>
+      </w:r>
+      <w:proofErr w:type="gramEnd"/>
+      <w:r>
+        <w:rPr>
+          <w:color w:val="000000" w:themeColor="text1"/>
+        </w:rPr>
+        <w:t xml:space="preserve"> , market </w:t>
+      </w:r>
+      <w:proofErr w:type="gramStart"/>
+      <w:r>
+        <w:rPr>
+          <w:color w:val="000000" w:themeColor="text1"/>
+        </w:rPr>
+        <w:t>cap ,</w:t>
+      </w:r>
+      <w:proofErr w:type="gramEnd"/>
+      <w:r>
+        <w:rPr>
+          <w:color w:val="000000" w:themeColor="text1"/>
+        </w:rPr>
+        <w:t xml:space="preserve"> current </w:t>
+      </w:r>
+      <w:proofErr w:type="gramStart"/>
+      <w:r>
+        <w:rPr>
+          <w:color w:val="000000" w:themeColor="text1"/>
+        </w:rPr>
+        <w:t>price ,</w:t>
+      </w:r>
+      <w:proofErr w:type="gramEnd"/>
+      <w:r>
+        <w:rPr>
+          <w:color w:val="000000" w:themeColor="text1"/>
+        </w:rPr>
+        <w:t xml:space="preserve"> ....) </w:t>
       </w:r>
     </w:p>
     <w:p>
@@ -3204,11 +4391,19 @@
           <w:color w:val="000000" w:themeColor="text1"/>
         </w:rPr>
       </w:pPr>
-      <w:r>
-        <w:rPr>
-          <w:color w:val="000000" w:themeColor="text1"/>
-        </w:rPr>
-        <w:t xml:space="preserve">Chatbot : </w:t>
+      <w:proofErr w:type="gramStart"/>
+      <w:r>
+        <w:rPr>
+          <w:color w:val="000000" w:themeColor="text1"/>
+        </w:rPr>
+        <w:t>Chatbot :</w:t>
+      </w:r>
+      <w:proofErr w:type="gramEnd"/>
+      <w:r>
+        <w:rPr>
+          <w:color w:val="000000" w:themeColor="text1"/>
+        </w:rPr>
+        <w:t xml:space="preserve"> </w:t>
       </w:r>
       <w:r>
         <w:rPr>
@@ -3302,112 +4497,606 @@
         </w:drawing>
       </w:r>
     </w:p>
-    <w:p>
-      <w:pPr>
-        <w:rPr>
-          <w:b/>
-          <w:bCs/>
-          <w:color w:val="000000" w:themeColor="text1"/>
-        </w:rPr>
-      </w:pPr>
-      <w:r>
-        <w:rPr>
-          <w:b/>
-          <w:bCs/>
-          <w:noProof/>
-          <w:color w:val="000000" w:themeColor="text1"/>
-        </w:rPr>
-        <w:drawing>
-          <wp:inline distT="0" distB="0" distL="0" distR="0" wp14:anchorId="69083201" wp14:editId="09A95E57">
-            <wp:extent cx="5731510" cy="2437765"/>
-            <wp:effectExtent l="0" t="0" r="2540" b="635"/>
-            <wp:docPr id="518315222" name="Picture 1"/>
-            <wp:cNvGraphicFramePr>
-              <a:graphicFrameLocks xmlns:a="http://schemas.openxmlformats.org/drawingml/2006/main" noChangeAspect="1"/>
-            </wp:cNvGraphicFramePr>
-            <a:graphic xmlns:a="http://schemas.openxmlformats.org/drawingml/2006/main">
-              <a:graphicData uri="http://schemas.openxmlformats.org/drawingml/2006/picture">
-                <pic:pic xmlns:pic="http://schemas.openxmlformats.org/drawingml/2006/picture">
-                  <pic:nvPicPr>
-                    <pic:cNvPr id="518315222" name=""/>
-                    <pic:cNvPicPr/>
-                  </pic:nvPicPr>
-                  <pic:blipFill>
-                    <a:blip r:embed="rId6"/>
-                    <a:stretch>
-                      <a:fillRect/>
-                    </a:stretch>
-                  </pic:blipFill>
-                  <pic:spPr>
-                    <a:xfrm>
-                      <a:off x="0" y="0"/>
-                      <a:ext cx="5731510" cy="2437765"/>
-                    </a:xfrm>
-                    <a:prstGeom prst="rect">
-                      <a:avLst/>
-                    </a:prstGeom>
-                  </pic:spPr>
-                </pic:pic>
-              </a:graphicData>
-            </a:graphic>
-          </wp:inline>
-        </w:drawing>
-      </w:r>
-    </w:p>
-    <w:p>
-      <w:pPr>
-        <w:rPr>
-          <w:color w:val="000000" w:themeColor="text1"/>
-        </w:rPr>
-      </w:pPr>
-    </w:p>
-    <w:p>
-      <w:pPr>
-        <w:rPr>
-          <w:color w:val="000000" w:themeColor="text1"/>
-        </w:rPr>
-      </w:pPr>
-      <w:r>
-        <w:rPr>
-          <w:color w:val="000000" w:themeColor="text1"/>
-        </w:rPr>
-        <w:lastRenderedPageBreak/>
-        <w:drawing>
-          <wp:inline distT="0" distB="0" distL="0" distR="0" wp14:anchorId="6E76ADA3" wp14:editId="59F038B4">
-            <wp:extent cx="4502381" cy="1587582"/>
-            <wp:effectExtent l="0" t="0" r="0" b="0"/>
-            <wp:docPr id="551835583" name="Picture 1"/>
-            <wp:cNvGraphicFramePr>
-              <a:graphicFrameLocks xmlns:a="http://schemas.openxmlformats.org/drawingml/2006/main" noChangeAspect="1"/>
-            </wp:cNvGraphicFramePr>
-            <a:graphic xmlns:a="http://schemas.openxmlformats.org/drawingml/2006/main">
-              <a:graphicData uri="http://schemas.openxmlformats.org/drawingml/2006/picture">
-                <pic:pic xmlns:pic="http://schemas.openxmlformats.org/drawingml/2006/picture">
-                  <pic:nvPicPr>
-                    <pic:cNvPr id="551835583" name=""/>
-                    <pic:cNvPicPr/>
-                  </pic:nvPicPr>
-                  <pic:blipFill>
-                    <a:blip r:embed="rId7"/>
-                    <a:stretch>
-                      <a:fillRect/>
-                    </a:stretch>
-                  </pic:blipFill>
-                  <pic:spPr>
-                    <a:xfrm>
-                      <a:off x="0" y="0"/>
-                      <a:ext cx="4502381" cy="1587582"/>
-                    </a:xfrm>
-                    <a:prstGeom prst="rect">
-                      <a:avLst/>
-                    </a:prstGeom>
-                  </pic:spPr>
-                </pic:pic>
-              </a:graphicData>
-            </a:graphic>
-          </wp:inline>
-        </w:drawing>
-      </w:r>
+    <w:tbl>
+      <w:tblPr>
+        <w:tblW w:w="0" w:type="auto"/>
+        <w:tblCellSpacing w:w="15" w:type="dxa"/>
+        <w:tblBorders>
+          <w:top w:val="single" w:sz="4" w:space="0" w:color="auto"/>
+          <w:left w:val="single" w:sz="4" w:space="0" w:color="auto"/>
+          <w:bottom w:val="single" w:sz="4" w:space="0" w:color="auto"/>
+          <w:right w:val="single" w:sz="4" w:space="0" w:color="auto"/>
+          <w:insideH w:val="single" w:sz="4" w:space="0" w:color="auto"/>
+          <w:insideV w:val="single" w:sz="4" w:space="0" w:color="auto"/>
+        </w:tblBorders>
+        <w:tblCellMar>
+          <w:top w:w="15" w:type="dxa"/>
+          <w:left w:w="15" w:type="dxa"/>
+          <w:bottom w:w="15" w:type="dxa"/>
+          <w:right w:w="15" w:type="dxa"/>
+        </w:tblCellMar>
+        <w:tblLook w:val="04A0" w:firstRow="1" w:lastRow="0" w:firstColumn="1" w:lastColumn="0" w:noHBand="0" w:noVBand="1"/>
+      </w:tblPr>
+      <w:tblGrid>
+        <w:gridCol w:w="1984"/>
+        <w:gridCol w:w="2666"/>
+        <w:gridCol w:w="2819"/>
+      </w:tblGrid>
+      <w:tr>
+        <w:trPr>
+          <w:tblHeader/>
+          <w:tblCellSpacing w:w="15" w:type="dxa"/>
+        </w:trPr>
+        <w:tc>
+          <w:tcPr>
+            <w:tcW w:w="0" w:type="auto"/>
+            <w:vAlign w:val="center"/>
+            <w:hideMark/>
+          </w:tcPr>
+          <w:p>
+            <w:pPr>
+              <w:rPr>
+                <w:b/>
+                <w:bCs/>
+                <w:color w:val="000000" w:themeColor="text1"/>
+                <w:lang w:val="en-DE"/>
+              </w:rPr>
+            </w:pPr>
+            <w:r>
+              <w:rPr>
+                <w:b/>
+                <w:bCs/>
+                <w:color w:val="000000" w:themeColor="text1"/>
+                <w:lang w:val="en-DE"/>
+              </w:rPr>
+              <w:t>Intent</w:t>
+            </w:r>
+          </w:p>
+        </w:tc>
+        <w:tc>
+          <w:tcPr>
+            <w:tcW w:w="0" w:type="auto"/>
+            <w:vAlign w:val="center"/>
+            <w:hideMark/>
+          </w:tcPr>
+          <w:p>
+            <w:pPr>
+              <w:rPr>
+                <w:b/>
+                <w:bCs/>
+                <w:color w:val="000000" w:themeColor="text1"/>
+                <w:lang w:val="en-DE"/>
+              </w:rPr>
+            </w:pPr>
+            <w:r>
+              <w:rPr>
+                <w:b/>
+                <w:bCs/>
+                <w:color w:val="000000" w:themeColor="text1"/>
+                <w:lang w:val="en-DE"/>
+              </w:rPr>
+              <w:t>Pipeline</w:t>
+            </w:r>
+          </w:p>
+        </w:tc>
+        <w:tc>
+          <w:tcPr>
+            <w:tcW w:w="0" w:type="auto"/>
+            <w:vAlign w:val="center"/>
+            <w:hideMark/>
+          </w:tcPr>
+          <w:p>
+            <w:pPr>
+              <w:rPr>
+                <w:b/>
+                <w:bCs/>
+                <w:color w:val="000000" w:themeColor="text1"/>
+                <w:lang w:val="en-DE"/>
+              </w:rPr>
+            </w:pPr>
+            <w:r>
+              <w:rPr>
+                <w:b/>
+                <w:bCs/>
+                <w:color w:val="000000" w:themeColor="text1"/>
+                <w:lang w:val="en-DE"/>
+              </w:rPr>
+              <w:t>Prompt style</w:t>
+            </w:r>
+          </w:p>
+        </w:tc>
+      </w:tr>
+      <w:tr>
+        <w:trPr>
+          <w:tblCellSpacing w:w="15" w:type="dxa"/>
+        </w:trPr>
+        <w:tc>
+          <w:tcPr>
+            <w:tcW w:w="0" w:type="auto"/>
+            <w:vAlign w:val="center"/>
+            <w:hideMark/>
+          </w:tcPr>
+          <w:p>
+            <w:pPr>
+              <w:rPr>
+                <w:b/>
+                <w:bCs/>
+                <w:color w:val="000000" w:themeColor="text1"/>
+                <w:lang w:val="en-DE"/>
+              </w:rPr>
+            </w:pPr>
+            <w:r>
+              <w:rPr>
+                <w:b/>
+                <w:bCs/>
+                <w:color w:val="000000" w:themeColor="text1"/>
+                <w:lang w:val="en-DE"/>
+              </w:rPr>
+              <w:t>prediction</w:t>
+            </w:r>
+          </w:p>
+        </w:tc>
+        <w:tc>
+          <w:tcPr>
+            <w:tcW w:w="0" w:type="auto"/>
+            <w:vAlign w:val="center"/>
+            <w:hideMark/>
+          </w:tcPr>
+          <w:p>
+            <w:pPr>
+              <w:rPr>
+                <w:b/>
+                <w:bCs/>
+                <w:color w:val="000000" w:themeColor="text1"/>
+                <w:lang w:val="en-DE"/>
+              </w:rPr>
+            </w:pPr>
+            <w:r>
+              <w:rPr>
+                <w:b/>
+                <w:bCs/>
+                <w:color w:val="000000" w:themeColor="text1"/>
+                <w:lang w:val="en-DE"/>
+              </w:rPr>
+              <w:t>ML + news</w:t>
+            </w:r>
+          </w:p>
+        </w:tc>
+        <w:tc>
+          <w:tcPr>
+            <w:tcW w:w="0" w:type="auto"/>
+            <w:vAlign w:val="center"/>
+            <w:hideMark/>
+          </w:tcPr>
+          <w:p>
+            <w:pPr>
+              <w:rPr>
+                <w:b/>
+                <w:bCs/>
+                <w:color w:val="000000" w:themeColor="text1"/>
+                <w:lang w:val="en-DE"/>
+              </w:rPr>
+            </w:pPr>
+            <w:r>
+              <w:rPr>
+                <w:b/>
+                <w:bCs/>
+                <w:color w:val="000000" w:themeColor="text1"/>
+                <w:lang w:val="en-DE"/>
+              </w:rPr>
+              <w:t>Directional forecast format</w:t>
+            </w:r>
+          </w:p>
+        </w:tc>
+      </w:tr>
+      <w:tr>
+        <w:trPr>
+          <w:tblCellSpacing w:w="15" w:type="dxa"/>
+        </w:trPr>
+        <w:tc>
+          <w:tcPr>
+            <w:tcW w:w="0" w:type="auto"/>
+            <w:vAlign w:val="center"/>
+            <w:hideMark/>
+          </w:tcPr>
+          <w:p>
+            <w:pPr>
+              <w:rPr>
+                <w:b/>
+                <w:bCs/>
+                <w:color w:val="000000" w:themeColor="text1"/>
+                <w:lang w:val="en-DE"/>
+              </w:rPr>
+            </w:pPr>
+            <w:r>
+              <w:rPr>
+                <w:b/>
+                <w:bCs/>
+                <w:color w:val="000000" w:themeColor="text1"/>
+                <w:lang w:val="en-DE"/>
+              </w:rPr>
+              <w:t>explanation</w:t>
+            </w:r>
+          </w:p>
+        </w:tc>
+        <w:tc>
+          <w:tcPr>
+            <w:tcW w:w="0" w:type="auto"/>
+            <w:vAlign w:val="center"/>
+            <w:hideMark/>
+          </w:tcPr>
+          <w:p>
+            <w:pPr>
+              <w:rPr>
+                <w:b/>
+                <w:bCs/>
+                <w:color w:val="000000" w:themeColor="text1"/>
+                <w:lang w:val="en-DE"/>
+              </w:rPr>
+            </w:pPr>
+            <w:r>
+              <w:rPr>
+                <w:b/>
+                <w:bCs/>
+                <w:color w:val="000000" w:themeColor="text1"/>
+                <w:lang w:val="en-DE"/>
+              </w:rPr>
+              <w:t xml:space="preserve">News + </w:t>
+            </w:r>
+            <w:r>
+              <w:rPr>
+                <w:b/>
+                <w:bCs/>
+                <w:color w:val="000000" w:themeColor="text1"/>
+                <w:lang w:val="en-DE"/>
+              </w:rPr>
+              <w:t xml:space="preserve">live </w:t>
+            </w:r>
+            <w:r>
+              <w:rPr>
+                <w:b/>
+                <w:bCs/>
+                <w:color w:val="000000" w:themeColor="text1"/>
+                <w:lang w:val="en-DE"/>
+              </w:rPr>
+              <w:t>feature values</w:t>
+            </w:r>
+          </w:p>
+        </w:tc>
+        <w:tc>
+          <w:tcPr>
+            <w:tcW w:w="0" w:type="auto"/>
+            <w:vAlign w:val="center"/>
+            <w:hideMark/>
+          </w:tcPr>
+          <w:p>
+            <w:pPr>
+              <w:rPr>
+                <w:b/>
+                <w:bCs/>
+                <w:color w:val="000000" w:themeColor="text1"/>
+                <w:lang w:val="en-DE"/>
+              </w:rPr>
+            </w:pPr>
+            <w:r>
+              <w:rPr>
+                <w:b/>
+                <w:bCs/>
+                <w:color w:val="000000" w:themeColor="text1"/>
+                <w:lang w:val="en-DE"/>
+              </w:rPr>
+              <w:t>"Why" analytical format</w:t>
+            </w:r>
+          </w:p>
+        </w:tc>
+      </w:tr>
+      <w:tr>
+        <w:trPr>
+          <w:tblCellSpacing w:w="15" w:type="dxa"/>
+        </w:trPr>
+        <w:tc>
+          <w:tcPr>
+            <w:tcW w:w="0" w:type="auto"/>
+            <w:vAlign w:val="center"/>
+            <w:hideMark/>
+          </w:tcPr>
+          <w:p>
+            <w:pPr>
+              <w:rPr>
+                <w:b/>
+                <w:bCs/>
+                <w:color w:val="000000" w:themeColor="text1"/>
+                <w:lang w:val="en-DE"/>
+              </w:rPr>
+            </w:pPr>
+            <w:proofErr w:type="spellStart"/>
+            <w:r>
+              <w:rPr>
+                <w:b/>
+                <w:bCs/>
+                <w:color w:val="000000" w:themeColor="text1"/>
+                <w:lang w:val="en-DE"/>
+              </w:rPr>
+              <w:t>market_overview</w:t>
+            </w:r>
+            <w:proofErr w:type="spellEnd"/>
+          </w:p>
+        </w:tc>
+        <w:tc>
+          <w:tcPr>
+            <w:tcW w:w="0" w:type="auto"/>
+            <w:vAlign w:val="center"/>
+            <w:hideMark/>
+          </w:tcPr>
+          <w:p>
+            <w:pPr>
+              <w:rPr>
+                <w:b/>
+                <w:bCs/>
+                <w:color w:val="000000" w:themeColor="text1"/>
+                <w:lang w:val="en-DE"/>
+              </w:rPr>
+            </w:pPr>
+            <w:r>
+              <w:rPr>
+                <w:b/>
+                <w:bCs/>
+                <w:color w:val="000000" w:themeColor="text1"/>
+                <w:lang w:val="en-DE"/>
+              </w:rPr>
+              <w:t>News only</w:t>
+            </w:r>
+            <w:r>
+              <w:rPr>
+                <w:b/>
+                <w:bCs/>
+                <w:color w:val="000000" w:themeColor="text1"/>
+                <w:lang w:val="en-DE"/>
+              </w:rPr>
+              <w:t xml:space="preserve"> </w:t>
+            </w:r>
+            <w:proofErr w:type="gramStart"/>
+            <w:r>
+              <w:rPr>
+                <w:b/>
+                <w:bCs/>
+                <w:color w:val="000000" w:themeColor="text1"/>
+                <w:lang w:val="en-DE"/>
+              </w:rPr>
+              <w:t>( BTC</w:t>
+            </w:r>
+            <w:proofErr w:type="gramEnd"/>
+            <w:r>
+              <w:rPr>
+                <w:b/>
+                <w:bCs/>
+                <w:color w:val="000000" w:themeColor="text1"/>
+                <w:lang w:val="en-DE"/>
+              </w:rPr>
+              <w:t xml:space="preserve"> / ETH)</w:t>
+            </w:r>
+          </w:p>
+        </w:tc>
+        <w:tc>
+          <w:tcPr>
+            <w:tcW w:w="0" w:type="auto"/>
+            <w:vAlign w:val="center"/>
+            <w:hideMark/>
+          </w:tcPr>
+          <w:p>
+            <w:pPr>
+              <w:rPr>
+                <w:b/>
+                <w:bCs/>
+                <w:color w:val="000000" w:themeColor="text1"/>
+                <w:lang w:val="en-DE"/>
+              </w:rPr>
+            </w:pPr>
+            <w:r>
+              <w:rPr>
+                <w:b/>
+                <w:bCs/>
+                <w:color w:val="000000" w:themeColor="text1"/>
+                <w:lang w:val="en-DE"/>
+              </w:rPr>
+              <w:t>Summary format</w:t>
+            </w:r>
+          </w:p>
+        </w:tc>
+      </w:tr>
+      <w:tr>
+        <w:trPr>
+          <w:tblCellSpacing w:w="15" w:type="dxa"/>
+        </w:trPr>
+        <w:tc>
+          <w:tcPr>
+            <w:tcW w:w="0" w:type="auto"/>
+            <w:vAlign w:val="center"/>
+            <w:hideMark/>
+          </w:tcPr>
+          <w:p>
+            <w:pPr>
+              <w:rPr>
+                <w:b/>
+                <w:bCs/>
+                <w:color w:val="000000" w:themeColor="text1"/>
+                <w:lang w:val="en-DE"/>
+              </w:rPr>
+            </w:pPr>
+            <w:proofErr w:type="spellStart"/>
+            <w:r>
+              <w:rPr>
+                <w:b/>
+                <w:bCs/>
+                <w:color w:val="000000" w:themeColor="text1"/>
+                <w:lang w:val="en-DE"/>
+              </w:rPr>
+              <w:t>investment_advice</w:t>
+            </w:r>
+            <w:proofErr w:type="spellEnd"/>
+          </w:p>
+        </w:tc>
+        <w:tc>
+          <w:tcPr>
+            <w:tcW w:w="0" w:type="auto"/>
+            <w:vAlign w:val="center"/>
+            <w:hideMark/>
+          </w:tcPr>
+          <w:p>
+            <w:pPr>
+              <w:rPr>
+                <w:b/>
+                <w:bCs/>
+                <w:color w:val="000000" w:themeColor="text1"/>
+                <w:lang w:val="en-DE"/>
+              </w:rPr>
+            </w:pPr>
+            <w:r>
+              <w:rPr>
+                <w:b/>
+                <w:bCs/>
+                <w:color w:val="000000" w:themeColor="text1"/>
+                <w:lang w:val="en-DE"/>
+              </w:rPr>
+              <w:t>ML + news</w:t>
+            </w:r>
+          </w:p>
+        </w:tc>
+        <w:tc>
+          <w:tcPr>
+            <w:tcW w:w="0" w:type="auto"/>
+            <w:vAlign w:val="center"/>
+            <w:hideMark/>
+          </w:tcPr>
+          <w:p>
+            <w:pPr>
+              <w:rPr>
+                <w:b/>
+                <w:bCs/>
+                <w:color w:val="000000" w:themeColor="text1"/>
+                <w:lang w:val="en-DE"/>
+              </w:rPr>
+            </w:pPr>
+            <w:r>
+              <w:rPr>
+                <w:b/>
+                <w:bCs/>
+                <w:color w:val="000000" w:themeColor="text1"/>
+                <w:lang w:val="en-DE"/>
+              </w:rPr>
+              <w:t>Risk-aware advisory format</w:t>
+            </w:r>
+          </w:p>
+        </w:tc>
+      </w:tr>
+      <w:tr>
+        <w:trPr>
+          <w:tblCellSpacing w:w="15" w:type="dxa"/>
+        </w:trPr>
+        <w:tc>
+          <w:tcPr>
+            <w:tcW w:w="0" w:type="auto"/>
+            <w:vAlign w:val="center"/>
+            <w:hideMark/>
+          </w:tcPr>
+          <w:p>
+            <w:pPr>
+              <w:rPr>
+                <w:b/>
+                <w:bCs/>
+                <w:color w:val="000000" w:themeColor="text1"/>
+                <w:lang w:val="en-DE"/>
+              </w:rPr>
+            </w:pPr>
+            <w:proofErr w:type="spellStart"/>
+            <w:r>
+              <w:rPr>
+                <w:b/>
+                <w:bCs/>
+                <w:color w:val="000000" w:themeColor="text1"/>
+                <w:lang w:val="en-DE"/>
+              </w:rPr>
+              <w:t>off_topic</w:t>
+            </w:r>
+            <w:proofErr w:type="spellEnd"/>
+          </w:p>
+        </w:tc>
+        <w:tc>
+          <w:tcPr>
+            <w:tcW w:w="0" w:type="auto"/>
+            <w:vAlign w:val="center"/>
+            <w:hideMark/>
+          </w:tcPr>
+          <w:p>
+            <w:pPr>
+              <w:rPr>
+                <w:b/>
+                <w:bCs/>
+                <w:color w:val="000000" w:themeColor="text1"/>
+                <w:lang w:val="en-DE"/>
+              </w:rPr>
+            </w:pPr>
+            <w:r>
+              <w:rPr>
+                <w:b/>
+                <w:bCs/>
+                <w:color w:val="000000" w:themeColor="text1"/>
+                <w:lang w:val="en-DE"/>
+              </w:rPr>
+              <w:t>Nothing</w:t>
+            </w:r>
+          </w:p>
+        </w:tc>
+        <w:tc>
+          <w:tcPr>
+            <w:tcW w:w="0" w:type="auto"/>
+            <w:vAlign w:val="center"/>
+            <w:hideMark/>
+          </w:tcPr>
+          <w:p>
+            <w:pPr>
+              <w:rPr>
+                <w:b/>
+                <w:bCs/>
+                <w:color w:val="000000" w:themeColor="text1"/>
+                <w:lang w:val="en-DE"/>
+              </w:rPr>
+            </w:pPr>
+            <w:r>
+              <w:rPr>
+                <w:b/>
+                <w:bCs/>
+                <w:color w:val="000000" w:themeColor="text1"/>
+                <w:lang w:val="en-DE"/>
+              </w:rPr>
+              <w:t>Polite rejection</w:t>
+            </w:r>
+          </w:p>
+        </w:tc>
+      </w:tr>
+    </w:tbl>
+    <w:p>
+      <w:pPr>
+        <w:rPr>
+          <w:b/>
+          <w:bCs/>
+          <w:color w:val="000000" w:themeColor="text1"/>
+        </w:rPr>
+      </w:pPr>
+    </w:p>
+    <w:p>
+      <w:pPr>
+        <w:rPr>
+          <w:color w:val="000000" w:themeColor="text1"/>
+        </w:rPr>
+      </w:pPr>
+    </w:p>
+    <w:p>
+      <w:pPr>
+        <w:rPr>
+          <w:color w:val="000000" w:themeColor="text1"/>
+        </w:rPr>
+      </w:pPr>
     </w:p>
     <w:p>
       <w:pPr>
@@ -7279,7 +8968,6 @@
   <w:style w:type="character" w:default="1" w:styleId="DefaultParagraphFont">
     <w:name w:val="Default Paragraph Font"/>
     <w:uiPriority w:val="1"/>
-    <w:semiHidden/>
     <w:unhideWhenUsed/>
   </w:style>
   <w:style w:type="table" w:default="1" w:styleId="TableNormal">

</xml_diff>

<commit_message>
updated the chatbot routing
</commit_message>
<xml_diff>
--- a/Final_project_roadmap_V0.docx
+++ b/Final_project_roadmap_V0.docx
@@ -4539,7 +4539,6 @@
                 <w:b/>
                 <w:bCs/>
                 <w:color w:val="000000" w:themeColor="text1"/>
-                <w:lang w:val="en-DE"/>
               </w:rPr>
             </w:pPr>
             <w:r>
@@ -4547,7 +4546,6 @@
                 <w:b/>
                 <w:bCs/>
                 <w:color w:val="000000" w:themeColor="text1"/>
-                <w:lang w:val="en-DE"/>
               </w:rPr>
               <w:t>Intent</w:t>
             </w:r>
@@ -4565,7 +4563,6 @@
                 <w:b/>
                 <w:bCs/>
                 <w:color w:val="000000" w:themeColor="text1"/>
-                <w:lang w:val="en-DE"/>
               </w:rPr>
             </w:pPr>
             <w:r>
@@ -4573,7 +4570,6 @@
                 <w:b/>
                 <w:bCs/>
                 <w:color w:val="000000" w:themeColor="text1"/>
-                <w:lang w:val="en-DE"/>
               </w:rPr>
               <w:t>Pipeline</w:t>
             </w:r>
@@ -4591,7 +4587,6 @@
                 <w:b/>
                 <w:bCs/>
                 <w:color w:val="000000" w:themeColor="text1"/>
-                <w:lang w:val="en-DE"/>
               </w:rPr>
             </w:pPr>
             <w:r>
@@ -4599,7 +4594,6 @@
                 <w:b/>
                 <w:bCs/>
                 <w:color w:val="000000" w:themeColor="text1"/>
-                <w:lang w:val="en-DE"/>
               </w:rPr>
               <w:t>Prompt style</w:t>
             </w:r>
@@ -4622,7 +4616,6 @@
                 <w:b/>
                 <w:bCs/>
                 <w:color w:val="000000" w:themeColor="text1"/>
-                <w:lang w:val="en-DE"/>
               </w:rPr>
             </w:pPr>
             <w:r>
@@ -4630,7 +4623,6 @@
                 <w:b/>
                 <w:bCs/>
                 <w:color w:val="000000" w:themeColor="text1"/>
-                <w:lang w:val="en-DE"/>
               </w:rPr>
               <w:t>prediction</w:t>
             </w:r>
@@ -4648,7 +4640,6 @@
                 <w:b/>
                 <w:bCs/>
                 <w:color w:val="000000" w:themeColor="text1"/>
-                <w:lang w:val="en-DE"/>
               </w:rPr>
             </w:pPr>
             <w:r>
@@ -4656,7 +4647,6 @@
                 <w:b/>
                 <w:bCs/>
                 <w:color w:val="000000" w:themeColor="text1"/>
-                <w:lang w:val="en-DE"/>
               </w:rPr>
               <w:t>ML + news</w:t>
             </w:r>
@@ -4674,7 +4664,6 @@
                 <w:b/>
                 <w:bCs/>
                 <w:color w:val="000000" w:themeColor="text1"/>
-                <w:lang w:val="en-DE"/>
               </w:rPr>
             </w:pPr>
             <w:r>
@@ -4682,7 +4671,6 @@
                 <w:b/>
                 <w:bCs/>
                 <w:color w:val="000000" w:themeColor="text1"/>
-                <w:lang w:val="en-DE"/>
               </w:rPr>
               <w:t>Directional forecast format</w:t>
             </w:r>
@@ -4705,7 +4693,6 @@
                 <w:b/>
                 <w:bCs/>
                 <w:color w:val="000000" w:themeColor="text1"/>
-                <w:lang w:val="en-DE"/>
               </w:rPr>
             </w:pPr>
             <w:r>
@@ -4713,7 +4700,6 @@
                 <w:b/>
                 <w:bCs/>
                 <w:color w:val="000000" w:themeColor="text1"/>
-                <w:lang w:val="en-DE"/>
               </w:rPr>
               <w:t>explanation</w:t>
             </w:r>
@@ -4731,7 +4717,6 @@
                 <w:b/>
                 <w:bCs/>
                 <w:color w:val="000000" w:themeColor="text1"/>
-                <w:lang w:val="en-DE"/>
               </w:rPr>
             </w:pPr>
             <w:r>
@@ -4739,7 +4724,6 @@
                 <w:b/>
                 <w:bCs/>
                 <w:color w:val="000000" w:themeColor="text1"/>
-                <w:lang w:val="en-DE"/>
               </w:rPr>
               <w:t xml:space="preserve">News + </w:t>
             </w:r>
@@ -4748,7 +4732,6 @@
                 <w:b/>
                 <w:bCs/>
                 <w:color w:val="000000" w:themeColor="text1"/>
-                <w:lang w:val="en-DE"/>
               </w:rPr>
               <w:t xml:space="preserve">live </w:t>
             </w:r>
@@ -4757,7 +4740,6 @@
                 <w:b/>
                 <w:bCs/>
                 <w:color w:val="000000" w:themeColor="text1"/>
-                <w:lang w:val="en-DE"/>
               </w:rPr>
               <w:t>feature values</w:t>
             </w:r>
@@ -4775,7 +4757,6 @@
                 <w:b/>
                 <w:bCs/>
                 <w:color w:val="000000" w:themeColor="text1"/>
-                <w:lang w:val="en-DE"/>
               </w:rPr>
             </w:pPr>
             <w:r>
@@ -4783,7 +4764,6 @@
                 <w:b/>
                 <w:bCs/>
                 <w:color w:val="000000" w:themeColor="text1"/>
-                <w:lang w:val="en-DE"/>
               </w:rPr>
               <w:t>"Why" analytical format</w:t>
             </w:r>
@@ -4806,7 +4786,6 @@
                 <w:b/>
                 <w:bCs/>
                 <w:color w:val="000000" w:themeColor="text1"/>
-                <w:lang w:val="en-DE"/>
               </w:rPr>
             </w:pPr>
             <w:proofErr w:type="spellStart"/>
@@ -4815,7 +4794,6 @@
                 <w:b/>
                 <w:bCs/>
                 <w:color w:val="000000" w:themeColor="text1"/>
-                <w:lang w:val="en-DE"/>
               </w:rPr>
               <w:t>market_overview</w:t>
             </w:r>
@@ -4834,7 +4812,6 @@
                 <w:b/>
                 <w:bCs/>
                 <w:color w:val="000000" w:themeColor="text1"/>
-                <w:lang w:val="en-DE"/>
               </w:rPr>
             </w:pPr>
             <w:r>
@@ -4842,38 +4819,8 @@
                 <w:b/>
                 <w:bCs/>
                 <w:color w:val="000000" w:themeColor="text1"/>
-                <w:lang w:val="en-DE"/>
               </w:rPr>
               <w:t>News only</w:t>
-            </w:r>
-            <w:r>
-              <w:rPr>
-                <w:b/>
-                <w:bCs/>
-                <w:color w:val="000000" w:themeColor="text1"/>
-                <w:lang w:val="en-DE"/>
-              </w:rPr>
-              <w:t xml:space="preserve"> </w:t>
-            </w:r>
-            <w:proofErr w:type="gramStart"/>
-            <w:r>
-              <w:rPr>
-                <w:b/>
-                <w:bCs/>
-                <w:color w:val="000000" w:themeColor="text1"/>
-                <w:lang w:val="en-DE"/>
-              </w:rPr>
-              <w:t>( BTC</w:t>
-            </w:r>
-            <w:proofErr w:type="gramEnd"/>
-            <w:r>
-              <w:rPr>
-                <w:b/>
-                <w:bCs/>
-                <w:color w:val="000000" w:themeColor="text1"/>
-                <w:lang w:val="en-DE"/>
-              </w:rPr>
-              <w:t xml:space="preserve"> / ETH)</w:t>
             </w:r>
           </w:p>
         </w:tc>
@@ -4889,7 +4836,6 @@
                 <w:b/>
                 <w:bCs/>
                 <w:color w:val="000000" w:themeColor="text1"/>
-                <w:lang w:val="en-DE"/>
               </w:rPr>
             </w:pPr>
             <w:r>
@@ -4897,7 +4843,6 @@
                 <w:b/>
                 <w:bCs/>
                 <w:color w:val="000000" w:themeColor="text1"/>
-                <w:lang w:val="en-DE"/>
               </w:rPr>
               <w:t>Summary format</w:t>
             </w:r>
@@ -4920,7 +4865,6 @@
                 <w:b/>
                 <w:bCs/>
                 <w:color w:val="000000" w:themeColor="text1"/>
-                <w:lang w:val="en-DE"/>
               </w:rPr>
             </w:pPr>
             <w:proofErr w:type="spellStart"/>
@@ -4929,7 +4873,6 @@
                 <w:b/>
                 <w:bCs/>
                 <w:color w:val="000000" w:themeColor="text1"/>
-                <w:lang w:val="en-DE"/>
               </w:rPr>
               <w:t>investment_advice</w:t>
             </w:r>
@@ -4948,7 +4891,6 @@
                 <w:b/>
                 <w:bCs/>
                 <w:color w:val="000000" w:themeColor="text1"/>
-                <w:lang w:val="en-DE"/>
               </w:rPr>
             </w:pPr>
             <w:r>
@@ -4956,7 +4898,6 @@
                 <w:b/>
                 <w:bCs/>
                 <w:color w:val="000000" w:themeColor="text1"/>
-                <w:lang w:val="en-DE"/>
               </w:rPr>
               <w:t>ML + news</w:t>
             </w:r>
@@ -4974,7 +4915,6 @@
                 <w:b/>
                 <w:bCs/>
                 <w:color w:val="000000" w:themeColor="text1"/>
-                <w:lang w:val="en-DE"/>
               </w:rPr>
             </w:pPr>
             <w:r>
@@ -4982,7 +4922,6 @@
                 <w:b/>
                 <w:bCs/>
                 <w:color w:val="000000" w:themeColor="text1"/>
-                <w:lang w:val="en-DE"/>
               </w:rPr>
               <w:t>Risk-aware advisory format</w:t>
             </w:r>
@@ -5005,7 +4944,6 @@
                 <w:b/>
                 <w:bCs/>
                 <w:color w:val="000000" w:themeColor="text1"/>
-                <w:lang w:val="en-DE"/>
               </w:rPr>
             </w:pPr>
             <w:proofErr w:type="spellStart"/>
@@ -5014,7 +4952,6 @@
                 <w:b/>
                 <w:bCs/>
                 <w:color w:val="000000" w:themeColor="text1"/>
-                <w:lang w:val="en-DE"/>
               </w:rPr>
               <w:t>off_topic</w:t>
             </w:r>
@@ -5033,7 +4970,6 @@
                 <w:b/>
                 <w:bCs/>
                 <w:color w:val="000000" w:themeColor="text1"/>
-                <w:lang w:val="en-DE"/>
               </w:rPr>
             </w:pPr>
             <w:r>
@@ -5041,7 +4977,6 @@
                 <w:b/>
                 <w:bCs/>
                 <w:color w:val="000000" w:themeColor="text1"/>
-                <w:lang w:val="en-DE"/>
               </w:rPr>
               <w:t>Nothing</w:t>
             </w:r>
@@ -5059,7 +4994,6 @@
                 <w:b/>
                 <w:bCs/>
                 <w:color w:val="000000" w:themeColor="text1"/>
-                <w:lang w:val="en-DE"/>
               </w:rPr>
             </w:pPr>
             <w:r>
@@ -5067,7 +5001,6 @@
                 <w:b/>
                 <w:bCs/>
                 <w:color w:val="000000" w:themeColor="text1"/>
-                <w:lang w:val="en-DE"/>
               </w:rPr>
               <w:t>Polite rejection</w:t>
             </w:r>
@@ -8968,6 +8901,7 @@
   <w:style w:type="character" w:default="1" w:styleId="DefaultParagraphFont">
     <w:name w:val="Default Paragraph Font"/>
     <w:uiPriority w:val="1"/>
+    <w:semiHidden/>
     <w:unhideWhenUsed/>
   </w:style>
   <w:style w:type="table" w:default="1" w:styleId="TableNormal">

</xml_diff>